<commit_message>
docs: bring the demo document up to what the editor does today
The capability summary still described comments without threads, a clipboard that dropped
formatting and sections nobody read, and it claimed a package size that has moved. It now says
what the editor does in a demo's voice, without figures that go stale, and the specimen gains a
tabs section and loses the double-spaced one.

The closing sections are regrouped so the two tables stand together, and a page break opens each
group so every page starts on a heading and neither table splits. The gaps between blocks are
empty paragraphs rather than paragraph spacing: the editor reads `w:spacing` and writes it back,
but nothing in it sets the value, so a demo that spaces its blocks that way shows a gap its own
reader could not make. The editor screenshot is taken again.
</commit_message>
<xml_diff>
--- a/__fixtures__/demo.docx
+++ b/__fixtures__/demo.docx
@@ -5,7 +5,7 @@
     <w:p>
       <w:pPr>
         <w:pStyle w:val="Heading1"/>
-        <w:spacing w:after="60"/>
+        <w:spacing w:line="276" w:lineRule="auto"/>
         <w:jc w:val="center"/>
       </w:pPr>
       <w:r>
@@ -21,7 +21,7 @@
     </w:p>
     <w:p>
       <w:pPr>
-        <w:spacing w:after="60"/>
+        <w:spacing w:line="276" w:lineRule="auto"/>
         <w:jc w:val="center"/>
       </w:pPr>
       <w:r>
@@ -37,8 +37,13 @@
     </w:p>
     <w:p>
       <w:pPr>
+        <w:spacing w:line="276" w:lineRule="auto"/>
+      </w:pPr>
+    </w:p>
+    <w:p>
+      <w:pPr>
         <w:pStyle w:val="Heading2"/>
-        <w:spacing w:before="320" w:after="120"/>
+        <w:spacing w:line="276" w:lineRule="auto"/>
       </w:pPr>
       <w:r>
         <w:rPr>
@@ -53,15 +58,15 @@
     </w:p>
     <w:p>
       <w:pPr>
-        <w:spacing w:after="140" w:line="276" w:lineRule="auto"/>
-        <w:jc w:val="both"/>
-      </w:pPr>
-      <w:r>
-        <w:rPr>
-          <w:sz w:val="22"/>
-          <w:szCs w:val="22"/>
-        </w:rPr>
-        <w:t xml:space="preserve">This set out to be a </w:t>
+        <w:spacing w:line="276" w:lineRule="auto"/>
+        <w:jc w:val="both"/>
+      </w:pPr>
+      <w:r>
+        <w:rPr>
+          <w:sz w:val="22"/>
+          <w:szCs w:val="22"/>
+        </w:rPr>
+        <w:t xml:space="preserve">This is a </w:t>
       </w:r>
       <w:r>
         <w:rPr>
@@ -77,58 +82,36 @@
           <w:sz w:val="22"/>
           <w:szCs w:val="22"/>
         </w:rPr>
-        <w:t xml:space="preserve">. It keeps to editing a document, and covers what editing one asks for: text and the formatting on it, paragraphs and the styles they name, lists, tables, inline pictures, links and locked blocks, over a real docx package.</w:t>
-      </w:r>
-    </w:p>
-    <w:p>
-      <w:pPr>
-        <w:spacing w:after="140" w:line="276" w:lineRule="auto"/>
-        <w:jc w:val="both"/>
-      </w:pPr>
-      <w:r>
-        <w:rPr>
-          <w:sz w:val="22"/>
-          <w:szCs w:val="22"/>
-        </w:rPr>
-        <w:t xml:space="preserve">The build emits the module graph one to one, so an import reaches only the module it names and what that module reads. Taking </w:t>
-      </w:r>
-      <w:r>
-        <w:rPr>
-          <w:b/>
-          <w:bCs/>
-          <w:sz w:val="22"/>
-          <w:szCs w:val="22"/>
-        </w:rPr>
-        <w:t xml:space="preserve">downloadDocx</w:t>
-      </w:r>
-      <w:r>
-        <w:rPr>
-          <w:sz w:val="22"/>
-          <w:szCs w:val="22"/>
-        </w:rPr>
-        <w:t xml:space="preserve"> out of the package costs a consumer well </w:t>
-      </w:r>
-      <w:r>
-        <w:rPr>
-          <w:b/>
-          <w:bCs/>
-          <w:sz w:val="22"/>
-          <w:szCs w:val="22"/>
-        </w:rPr>
-        <w:t xml:space="preserve">under a kilobyte</w:t>
-      </w:r>
-      <w:r>
-        <w:rPr>
-          <w:sz w:val="22"/>
-          <w:szCs w:val="22"/>
-        </w:rPr>
-        <w:t xml:space="preserve"> bundled and minified, and a test holds it there. The whole package is a couple of hundred kilobytes packed. Two packages are runtime dependencies; the editing engine and React are peers, so a host already carrying them does not pay twice.</w:t>
-      </w:r>
+        <w:t xml:space="preserve">. It keeps to editing a document, and covers what editing one asks for: text and the formatting on it, paragraphs and the styles they name, tabs, lists, tables, inline pictures, links and locked blocks, over a real docx package.</w:t>
+      </w:r>
+    </w:p>
+    <w:p>
+      <w:pPr>
+        <w:spacing w:line="276" w:lineRule="auto"/>
+      </w:pPr>
+    </w:p>
+    <w:p>
+      <w:pPr>
+        <w:spacing w:line="276" w:lineRule="auto"/>
+        <w:jc w:val="both"/>
+      </w:pPr>
+      <w:r>
+        <w:rPr>
+          <w:sz w:val="22"/>
+          <w:szCs w:val="22"/>
+        </w:rPr>
+        <w:t xml:space="preserve">The package is light to take on: two runtime dependencies, with the editing engine and React as peers, so a host already carrying them does not pay twice.</w:t>
+      </w:r>
+    </w:p>
+    <w:p>
+      <w:pPr>
+        <w:spacing w:line="276" w:lineRule="auto"/>
+      </w:pPr>
     </w:p>
     <w:p>
       <w:pPr>
         <w:pStyle w:val="Heading2"/>
-        <w:spacing w:before="320" w:after="120"/>
+        <w:spacing w:line="276" w:lineRule="auto"/>
       </w:pPr>
       <w:r>
         <w:rPr>
@@ -143,7 +126,7 @@
     </w:p>
     <w:p>
       <w:pPr>
-        <w:spacing w:after="140" w:line="276" w:lineRule="auto"/>
+        <w:spacing w:line="276" w:lineRule="auto"/>
         <w:jc w:val="both"/>
       </w:pPr>
       <w:r>
@@ -172,7 +155,12 @@
     </w:p>
     <w:p>
       <w:pPr>
-        <w:spacing w:after="140" w:line="276" w:lineRule="auto"/>
+        <w:spacing w:line="276" w:lineRule="auto"/>
+      </w:pPr>
+    </w:p>
+    <w:p>
+      <w:pPr>
+        <w:spacing w:line="276" w:lineRule="auto"/>
         <w:jc w:val="both"/>
       </w:pPr>
       <w:r>
@@ -201,8 +189,13 @@
     </w:p>
     <w:p>
       <w:pPr>
+        <w:spacing w:line="276" w:lineRule="auto"/>
+      </w:pPr>
+    </w:p>
+    <w:p>
+      <w:pPr>
         <w:pStyle w:val="Heading2"/>
-        <w:spacing w:before="320" w:after="120"/>
+        <w:spacing w:line="276" w:lineRule="auto"/>
       </w:pPr>
       <w:r>
         <w:rPr>
@@ -217,59 +210,44 @@
     </w:p>
     <w:p>
       <w:pPr>
-        <w:spacing w:after="140" w:line="276" w:lineRule="auto"/>
-        <w:jc w:val="both"/>
-      </w:pPr>
-      <w:r>
-        <w:rPr>
-          <w:sz w:val="22"/>
-          <w:szCs w:val="22"/>
-        </w:rPr>
-        <w:t xml:space="preserve">Comments can be viewed, created, edited and deleted. Footnote and endnote references and their plain-text bodies are shown, and the first section's header and footer are previewed with supported page fields.</w:t>
-      </w:r>
-    </w:p>
-    <w:p>
-      <w:pPr>
-        <w:spacing w:after="140" w:line="276" w:lineRule="auto"/>
-        <w:jc w:val="both"/>
-      </w:pPr>
-      <w:r>
-        <w:rPr>
-          <w:sz w:val="22"/>
-          <w:szCs w:val="22"/>
-        </w:rPr>
-        <w:t xml:space="preserve">Bookmarks stay invisible and attached to their document ranges. Tracked changes, unsupported fields, floating pictures, charts, text boxes and nested structures stay on the preservation path. Page guides and header or footer placement are visual approximations rather than print pagination.</w:t>
-      </w:r>
-    </w:p>
-    <w:p>
-      <w:pPr>
-        <w:shd w:val="clear" w:color="auto" w:fill="FFF2CC"/>
-        <w:spacing w:before="200" w:after="200" w:line="240" w:lineRule="auto"/>
-        <w:ind w:left="140" w:right="140"/>
-      </w:pPr>
-      <w:r>
-        <w:rPr>
-          <w:b/>
-          <w:bCs/>
-          <w:color w:val="7F4E14"/>
-          <w:sz w:val="22"/>
-          <w:szCs w:val="22"/>
-        </w:rPr>
-        <w:t xml:space="preserve">Note. </w:t>
-      </w:r>
-      <w:r>
-        <w:rPr>
-          <w:color w:val="7F4E14"/>
-          <w:sz w:val="22"/>
-          <w:szCs w:val="22"/>
-        </w:rPr>
-        <w:t xml:space="preserve">Two limits are met more often than the rest. Pasted text arrives as characters and its formatting is dropped. And an image over 16 MiB is preserved rather than drawn.</w:t>
-      </w:r>
+        <w:spacing w:line="276" w:lineRule="auto"/>
+        <w:jc w:val="both"/>
+      </w:pPr>
+      <w:r>
+        <w:rPr>
+          <w:sz w:val="22"/>
+          <w:szCs w:val="22"/>
+        </w:rPr>
+        <w:t xml:space="preserve">The editor opens read-only, for commenting, or for editing, and whichever way it is open the document goes back out as a docx. Comments come with their threads and the author on each, and footnotes, endnotes, headers and footers are shown as the document wrote them. Text pasted in keeps the formatting, links and lists it came with.</w:t>
+      </w:r>
+    </w:p>
+    <w:p>
+      <w:pPr>
+        <w:spacing w:line="276" w:lineRule="auto"/>
+      </w:pPr>
+    </w:p>
+    <w:p>
+      <w:pPr>
+        <w:spacing w:line="276" w:lineRule="auto"/>
+        <w:jc w:val="both"/>
+      </w:pPr>
+      <w:r>
+        <w:rPr>
+          <w:sz w:val="22"/>
+          <w:szCs w:val="22"/>
+        </w:rPr>
+        <w:t xml:space="preserve">What the editor does not model is kept rather than dropped, and the text around it stays editable. The page marks are a guide to the layout rather than print pagination.</w:t>
+      </w:r>
+    </w:p>
+    <w:p>
+      <w:pPr>
+        <w:spacing w:line="276" w:lineRule="auto"/>
+      </w:pPr>
     </w:p>
     <w:p>
       <w:pPr>
         <w:pStyle w:val="Heading2"/>
-        <w:spacing w:before="320" w:after="120"/>
+        <w:spacing w:line="276" w:lineRule="auto"/>
       </w:pPr>
       <w:r>
         <w:rPr>
@@ -284,7 +262,7 @@
     </w:p>
     <w:p>
       <w:pPr>
-        <w:spacing w:after="140" w:line="276" w:lineRule="auto"/>
+        <w:spacing w:line="276" w:lineRule="auto"/>
         <w:jc w:val="both"/>
       </w:pPr>
       <w:r>
@@ -298,7 +276,7 @@
     <w:p>
       <w:pPr>
         <w:pStyle w:val="Heading1"/>
-        <w:spacing w:before="0" w:after="160"/>
+        <w:spacing w:line="276" w:lineRule="auto"/>
       </w:pPr>
       <w:r>
         <w:br w:type="page"/>
@@ -316,7 +294,7 @@
     </w:p>
     <w:p>
       <w:pPr>
-        <w:spacing w:after="140" w:line="276" w:lineRule="auto"/>
+        <w:spacing w:line="276" w:lineRule="auto"/>
         <w:jc w:val="both"/>
       </w:pPr>
       <w:r>
@@ -329,8 +307,13 @@
     </w:p>
     <w:p>
       <w:pPr>
+        <w:spacing w:line="276" w:lineRule="auto"/>
+      </w:pPr>
+    </w:p>
+    <w:p>
+      <w:pPr>
         <w:pStyle w:val="Heading2"/>
-        <w:spacing w:before="320" w:after="120"/>
+        <w:spacing w:line="276" w:lineRule="auto"/>
       </w:pPr>
       <w:r>
         <w:rPr>
@@ -345,7 +328,7 @@
     </w:p>
     <w:p>
       <w:pPr>
-        <w:spacing w:after="140" w:line="276" w:lineRule="auto"/>
+        <w:spacing w:line="276" w:lineRule="auto"/>
         <w:jc w:val="left"/>
       </w:pPr>
       <w:r>
@@ -358,7 +341,12 @@
     </w:p>
     <w:p>
       <w:pPr>
-        <w:spacing w:after="140" w:line="276" w:lineRule="auto"/>
+        <w:spacing w:line="276" w:lineRule="auto"/>
+      </w:pPr>
+    </w:p>
+    <w:p>
+      <w:pPr>
+        <w:spacing w:line="276" w:lineRule="auto"/>
         <w:jc w:val="center"/>
       </w:pPr>
       <w:r>
@@ -371,7 +359,12 @@
     </w:p>
     <w:p>
       <w:pPr>
-        <w:spacing w:after="140" w:line="276" w:lineRule="auto"/>
+        <w:spacing w:line="276" w:lineRule="auto"/>
+      </w:pPr>
+    </w:p>
+    <w:p>
+      <w:pPr>
+        <w:spacing w:line="276" w:lineRule="auto"/>
         <w:jc w:val="right"/>
       </w:pPr>
       <w:r>
@@ -384,7 +377,12 @@
     </w:p>
     <w:p>
       <w:pPr>
-        <w:spacing w:after="140" w:line="276" w:lineRule="auto"/>
+        <w:spacing w:line="276" w:lineRule="auto"/>
+      </w:pPr>
+    </w:p>
+    <w:p>
+      <w:pPr>
+        <w:spacing w:line="276" w:lineRule="auto"/>
         <w:jc w:val="both"/>
       </w:pPr>
       <w:r>
@@ -397,8 +395,13 @@
     </w:p>
     <w:p>
       <w:pPr>
+        <w:spacing w:line="276" w:lineRule="auto"/>
+      </w:pPr>
+    </w:p>
+    <w:p>
+      <w:pPr>
         <w:pStyle w:val="Heading2"/>
-        <w:spacing w:before="320" w:after="120"/>
+        <w:spacing w:line="276" w:lineRule="auto"/>
       </w:pPr>
       <w:r>
         <w:rPr>
@@ -413,7 +416,7 @@
     </w:p>
     <w:p>
       <w:pPr>
-        <w:spacing w:after="140" w:line="276" w:lineRule="auto"/>
+        <w:spacing w:line="276" w:lineRule="auto"/>
         <w:jc w:val="both"/>
       </w:pPr>
       <w:r>
@@ -426,7 +429,12 @@
     </w:p>
     <w:p>
       <w:pPr>
-        <w:spacing w:after="140" w:line="276" w:lineRule="auto"/>
+        <w:spacing w:line="276" w:lineRule="auto"/>
+      </w:pPr>
+    </w:p>
+    <w:p>
+      <w:pPr>
+        <w:spacing w:line="276" w:lineRule="auto"/>
         <w:ind w:left="720"/>
         <w:jc w:val="both"/>
       </w:pPr>
@@ -440,8 +448,13 @@
     </w:p>
     <w:p>
       <w:pPr>
+        <w:spacing w:line="276" w:lineRule="auto"/>
+      </w:pPr>
+    </w:p>
+    <w:p>
+      <w:pPr>
         <w:pStyle w:val="Heading2"/>
-        <w:spacing w:before="320" w:after="120"/>
+        <w:spacing w:line="276" w:lineRule="auto"/>
       </w:pPr>
       <w:r>
         <w:rPr>
@@ -456,7 +469,7 @@
     </w:p>
     <w:p>
       <w:pPr>
-        <w:spacing w:after="140" w:line="276" w:lineRule="auto"/>
+        <w:spacing w:line="276" w:lineRule="auto"/>
         <w:jc w:val="both"/>
       </w:pPr>
       <w:r>
@@ -469,7 +482,12 @@
     </w:p>
     <w:p>
       <w:pPr>
-        <w:spacing w:after="140" w:line="240" w:lineRule="auto"/>
+        <w:spacing w:line="276" w:lineRule="auto"/>
+      </w:pPr>
+    </w:p>
+    <w:p>
+      <w:pPr>
+        <w:spacing w:line="240" w:lineRule="auto"/>
         <w:jc w:val="both"/>
       </w:pPr>
       <w:r>
@@ -482,34 +500,31 @@
     </w:p>
     <w:p>
       <w:pPr>
-        <w:spacing w:after="140" w:line="276" w:lineRule="auto"/>
-        <w:jc w:val="both"/>
-      </w:pPr>
-      <w:r>
-        <w:rPr>
-          <w:sz w:val="22"/>
-          <w:szCs w:val="22"/>
-        </w:rPr>
-        <w:t xml:space="preserve">This paragraph is set at 1.15 lines (w:line=276), the spacing the prose in the first half uses: close enough to single not to draw attention, open enough to read a long paragraph in.</w:t>
-      </w:r>
-    </w:p>
-    <w:p>
-      <w:pPr>
-        <w:spacing w:after="140" w:line="480" w:lineRule="auto"/>
-        <w:jc w:val="both"/>
-      </w:pPr>
-      <w:r>
-        <w:rPr>
-          <w:sz w:val="22"/>
-          <w:szCs w:val="22"/>
-        </w:rPr>
-        <w:t xml:space="preserve">This paragraph is double spaced (w:line=480). Twice the height of a line goes to every line, which makes the setting unmistakable beside the two above.</w:t>
-      </w:r>
+        <w:spacing w:line="276" w:lineRule="auto"/>
+      </w:pPr>
+    </w:p>
+    <w:p>
+      <w:pPr>
+        <w:spacing w:line="276" w:lineRule="auto"/>
+        <w:jc w:val="both"/>
+      </w:pPr>
+      <w:r>
+        <w:rPr>
+          <w:sz w:val="22"/>
+          <w:szCs w:val="22"/>
+        </w:rPr>
+        <w:t xml:space="preserve">This paragraph is set at 1.15 lines (w:line=276), the spacing the rest of this document uses: close enough to single not to draw attention, open enough to read a long paragraph in.</w:t>
+      </w:r>
+    </w:p>
+    <w:p>
+      <w:pPr>
+        <w:spacing w:line="276" w:lineRule="auto"/>
+      </w:pPr>
     </w:p>
     <w:p>
       <w:pPr>
         <w:pStyle w:val="Heading2"/>
-        <w:spacing w:before="320" w:after="120"/>
+        <w:spacing w:line="276" w:lineRule="auto"/>
       </w:pPr>
       <w:r>
         <w:rPr>
@@ -519,160 +534,153 @@
           <w:sz w:val="26"/>
           <w:szCs w:val="26"/>
         </w:rPr>
-        <w:t xml:space="preserve">8. Run formatting</w:t>
-      </w:r>
-    </w:p>
-    <w:p>
-      <w:pPr>
-        <w:spacing w:after="140" w:line="276" w:lineRule="auto"/>
-        <w:jc w:val="both"/>
-      </w:pPr>
-      <w:r>
-        <w:rPr>
-          <w:sz w:val="22"/>
-          <w:szCs w:val="22"/>
-        </w:rPr>
-        <w:t xml:space="preserve">Formatting belongs to the run, so one sentence can carry several: this is </w:t>
-      </w:r>
-      <w:r>
-        <w:rPr>
-          <w:b/>
-          <w:bCs/>
-          <w:sz w:val="22"/>
-          <w:szCs w:val="22"/>
-        </w:rPr>
-        <w:t xml:space="preserve">bold</w:t>
-      </w:r>
-      <w:r>
-        <w:rPr>
-          <w:sz w:val="22"/>
-          <w:szCs w:val="22"/>
-        </w:rPr>
-        <w:t xml:space="preserve">, this is </w:t>
-      </w:r>
-      <w:r>
-        <w:rPr>
-          <w:i/>
-          <w:iCs/>
-          <w:sz w:val="22"/>
-          <w:szCs w:val="22"/>
-        </w:rPr>
-        <w:t xml:space="preserve">italic</w:t>
-      </w:r>
-      <w:r>
-        <w:rPr>
-          <w:sz w:val="22"/>
-          <w:szCs w:val="22"/>
-        </w:rPr>
-        <w:t xml:space="preserve">, this is </w:t>
-      </w:r>
-      <w:r>
-        <w:rPr>
-          <w:sz w:val="22"/>
-          <w:szCs w:val="22"/>
-          <w:u w:val="single"/>
-        </w:rPr>
-        <w:t xml:space="preserve">underlined</w:t>
-      </w:r>
-      <w:r>
-        <w:rPr>
-          <w:sz w:val="22"/>
-          <w:szCs w:val="22"/>
-        </w:rPr>
-        <w:t xml:space="preserve"> and </w:t>
-      </w:r>
-      <w:r>
-        <w:rPr>
-          <w:strike/>
-          <w:sz w:val="22"/>
-          <w:szCs w:val="22"/>
-        </w:rPr>
-        <w:t xml:space="preserve">this stretch is struck through</w:t>
-      </w:r>
-      <w:r>
-        <w:rPr>
-          <w:sz w:val="22"/>
-          <w:szCs w:val="22"/>
-        </w:rPr>
-        <w:t xml:space="preserve">, each set the way it says it is.</w:t>
-      </w:r>
-    </w:p>
-    <w:p>
-      <w:pPr>
-        <w:spacing w:after="140" w:line="276" w:lineRule="auto"/>
-        <w:jc w:val="both"/>
-      </w:pPr>
-      <w:r>
-        <w:rPr>
-          <w:sz w:val="22"/>
-          <w:szCs w:val="22"/>
-        </w:rPr>
-        <w:t xml:space="preserve">A size is written in half points, so </w:t>
-      </w:r>
-      <w:r>
-        <w:rPr>
-          <w:sz w:val="16"/>
-          <w:szCs w:val="16"/>
-        </w:rPr>
-        <w:t xml:space="preserve">this run is 8pt (w:sz=16)</w:t>
-      </w:r>
-      <w:r>
-        <w:rPr>
-          <w:sz w:val="22"/>
-          <w:szCs w:val="22"/>
-        </w:rPr>
-        <w:t xml:space="preserve"> and </w:t>
-      </w:r>
-      <w:r>
-        <w:rPr>
-          <w:sz w:val="28"/>
-          <w:szCs w:val="28"/>
-        </w:rPr>
-        <w:t xml:space="preserve">this one is 14pt (w:sz=28)</w:t>
-      </w:r>
-      <w:r>
-        <w:rPr>
-          <w:sz w:val="22"/>
-          <w:szCs w:val="22"/>
-        </w:rPr>
-        <w:t xml:space="preserve">. A colour is six hexadecimal digits: </w:t>
-      </w:r>
-      <w:r>
-        <w:rPr>
-          <w:color w:val="1F3864"/>
-          <w:sz w:val="22"/>
-          <w:szCs w:val="22"/>
-        </w:rPr>
-        <w:t xml:space="preserve">this run is coloured 1F3864 (w:color=1F3864)</w:t>
-      </w:r>
-      <w:r>
-        <w:rPr>
-          <w:sz w:val="22"/>
-          <w:szCs w:val="22"/>
-        </w:rPr>
-        <w:t xml:space="preserve">, and </w:t>
-      </w:r>
-      <w:r>
-        <w:rPr>
-          <w:sz w:val="22"/>
-          <w:szCs w:val="22"/>
-          <w:shd w:val="clear" w:color="auto" w:fill="FFF2CC"/>
-        </w:rPr>
-        <w:t xml:space="preserve">this one carries a shading fill of FFF2CC (w:shd w:fill=FFF2CC)</w:t>
-      </w:r>
-      <w:r>
-        <w:rPr>
-          <w:sz w:val="22"/>
-          <w:szCs w:val="22"/>
-        </w:rPr>
-        <w:t xml:space="preserve">.</w:t>
-      </w:r>
+        <w:t xml:space="preserve">8. Tabs</w:t>
+      </w:r>
+    </w:p>
+    <w:p>
+      <w:pPr>
+        <w:spacing w:line="276" w:lineRule="auto"/>
+        <w:jc w:val="both"/>
+      </w:pPr>
+      <w:r>
+        <w:rPr>
+          <w:sz w:val="22"/>
+          <w:szCs w:val="22"/>
+        </w:rPr>
+        <w:t xml:space="preserve">A tab jumps to the next stop its paragraph sets (w:tabs), and to the next multiple of the interval the document carries where it sets none (w:defaultTabStop, 720 twips).</w:t>
+      </w:r>
+    </w:p>
+    <w:p>
+      <w:pPr>
+        <w:spacing w:line="276" w:lineRule="auto"/>
+      </w:pPr>
+    </w:p>
+    <w:p>
+      <w:pPr>
+        <w:tabs>
+          <w:tab w:val="left" w:pos="2400"/>
+          <w:tab w:val="center" w:pos="5400"/>
+          <w:tab w:val="right" w:pos="9026"/>
+        </w:tabs>
+        <w:spacing w:line="276" w:lineRule="auto"/>
+      </w:pPr>
+      <w:r>
+        <w:rPr>
+          <w:sz w:val="22"/>
+          <w:szCs w:val="22"/>
+        </w:rPr>
+        <w:t xml:space="preserve">Three stops</w:t>
+      </w:r>
+      <w:r>
+        <w:rPr>
+          <w:sz w:val="22"/>
+          <w:szCs w:val="22"/>
+        </w:rPr>
+        <w:tab/>
+      </w:r>
+      <w:r>
+        <w:rPr>
+          <w:sz w:val="22"/>
+          <w:szCs w:val="22"/>
+        </w:rPr>
+        <w:t xml:space="preserve">left at 2400</w:t>
+      </w:r>
+      <w:r>
+        <w:rPr>
+          <w:sz w:val="22"/>
+          <w:szCs w:val="22"/>
+        </w:rPr>
+        <w:tab/>
+      </w:r>
+      <w:r>
+        <w:rPr>
+          <w:sz w:val="22"/>
+          <w:szCs w:val="22"/>
+        </w:rPr>
+        <w:t xml:space="preserve">centred at 5400</w:t>
+      </w:r>
+      <w:r>
+        <w:rPr>
+          <w:sz w:val="22"/>
+          <w:szCs w:val="22"/>
+        </w:rPr>
+        <w:tab/>
+      </w:r>
+      <w:r>
+        <w:rPr>
+          <w:sz w:val="22"/>
+          <w:szCs w:val="22"/>
+        </w:rPr>
+        <w:t xml:space="preserve">right at 9026</w:t>
+      </w:r>
+    </w:p>
+    <w:p>
+      <w:pPr>
+        <w:spacing w:line="276" w:lineRule="auto"/>
+      </w:pPr>
+      <w:r>
+        <w:rPr>
+          <w:sz w:val="22"/>
+          <w:szCs w:val="22"/>
+        </w:rPr>
+        <w:t xml:space="preserve">No stops</w:t>
+      </w:r>
+      <w:r>
+        <w:rPr>
+          <w:sz w:val="22"/>
+          <w:szCs w:val="22"/>
+        </w:rPr>
+        <w:tab/>
+      </w:r>
+      <w:r>
+        <w:rPr>
+          <w:sz w:val="22"/>
+          <w:szCs w:val="22"/>
+        </w:rPr>
+        <w:t xml:space="preserve">so each</w:t>
+      </w:r>
+      <w:r>
+        <w:rPr>
+          <w:sz w:val="22"/>
+          <w:szCs w:val="22"/>
+        </w:rPr>
+        <w:tab/>
+      </w:r>
+      <w:r>
+        <w:rPr>
+          <w:sz w:val="22"/>
+          <w:szCs w:val="22"/>
+        </w:rPr>
+        <w:t xml:space="preserve">tab falls on</w:t>
+      </w:r>
+      <w:r>
+        <w:rPr>
+          <w:sz w:val="22"/>
+          <w:szCs w:val="22"/>
+        </w:rPr>
+        <w:tab/>
+      </w:r>
+      <w:r>
+        <w:rPr>
+          <w:sz w:val="22"/>
+          <w:szCs w:val="22"/>
+        </w:rPr>
+        <w:t xml:space="preserve">the automatic interval.</w:t>
+      </w:r>
+    </w:p>
+    <w:p>
+      <w:pPr>
+        <w:spacing w:line="276" w:lineRule="auto"/>
+      </w:pPr>
     </w:p>
     <w:p>
       <w:pPr>
         <w:pStyle w:val="Heading2"/>
-        <w:spacing w:before="320" w:after="120"/>
-      </w:pPr>
+        <w:spacing w:line="276" w:lineRule="auto"/>
+      </w:pPr>
+      <w:r>
+        <w:br w:type="page"/>
+      </w:r>
       <w:r>
         <w:rPr>
           <w:b/>
@@ -681,36 +689,136 @@
           <w:sz w:val="26"/>
           <w:szCs w:val="26"/>
         </w:rPr>
-        <w:t xml:space="preserve">9. Fonts</w:t>
-      </w:r>
-    </w:p>
-    <w:p>
-      <w:pPr>
-        <w:spacing w:after="140" w:line="276" w:lineRule="auto"/>
-        <w:jc w:val="both"/>
-      </w:pPr>
-      <w:r>
-        <w:rPr>
-          <w:rFonts w:ascii="Georgia" w:hAnsi="Georgia"/>
-          <w:sz w:val="22"/>
-          <w:szCs w:val="22"/>
-        </w:rPr>
-        <w:t xml:space="preserve">This run names Georgia for the Latin slots (w:rFonts w:ascii=Georgia)</w:t>
-      </w:r>
-      <w:r>
-        <w:rPr>
-          <w:sz w:val="22"/>
-          <w:szCs w:val="22"/>
-        </w:rPr>
-        <w:t xml:space="preserve">, </w:t>
-      </w:r>
-      <w:r>
-        <w:rPr>
-          <w:rFonts w:ascii="Courier New" w:hAnsi="Courier New"/>
-          <w:sz w:val="22"/>
-          <w:szCs w:val="22"/>
-        </w:rPr>
-        <w:t xml:space="preserve">this one names Courier New (w:rFonts w:ascii=Courier New)</w:t>
+        <w:t xml:space="preserve">9. Character formatting</w:t>
+      </w:r>
+    </w:p>
+    <w:p>
+      <w:pPr>
+        <w:spacing w:line="276" w:lineRule="auto"/>
+        <w:jc w:val="both"/>
+      </w:pPr>
+      <w:r>
+        <w:rPr>
+          <w:sz w:val="22"/>
+          <w:szCs w:val="22"/>
+        </w:rPr>
+        <w:t xml:space="preserve">Formatting belongs to the run, so one sentence can carry several: this is </w:t>
+      </w:r>
+      <w:r>
+        <w:rPr>
+          <w:b/>
+          <w:bCs/>
+          <w:sz w:val="22"/>
+          <w:szCs w:val="22"/>
+        </w:rPr>
+        <w:t xml:space="preserve">bold</w:t>
+      </w:r>
+      <w:r>
+        <w:rPr>
+          <w:sz w:val="22"/>
+          <w:szCs w:val="22"/>
+        </w:rPr>
+        <w:t xml:space="preserve">, this is </w:t>
+      </w:r>
+      <w:r>
+        <w:rPr>
+          <w:i/>
+          <w:iCs/>
+          <w:sz w:val="22"/>
+          <w:szCs w:val="22"/>
+        </w:rPr>
+        <w:t xml:space="preserve">italic</w:t>
+      </w:r>
+      <w:r>
+        <w:rPr>
+          <w:sz w:val="22"/>
+          <w:szCs w:val="22"/>
+        </w:rPr>
+        <w:t xml:space="preserve">, this is </w:t>
+      </w:r>
+      <w:r>
+        <w:rPr>
+          <w:sz w:val="22"/>
+          <w:szCs w:val="22"/>
+          <w:u w:val="single"/>
+        </w:rPr>
+        <w:t xml:space="preserve">underlined</w:t>
+      </w:r>
+      <w:r>
+        <w:rPr>
+          <w:sz w:val="22"/>
+          <w:szCs w:val="22"/>
+        </w:rPr>
+        <w:t xml:space="preserve"> and </w:t>
+      </w:r>
+      <w:r>
+        <w:rPr>
+          <w:strike/>
+          <w:sz w:val="22"/>
+          <w:szCs w:val="22"/>
+        </w:rPr>
+        <w:t xml:space="preserve">this stretch is struck through</w:t>
+      </w:r>
+      <w:r>
+        <w:rPr>
+          <w:sz w:val="22"/>
+          <w:szCs w:val="22"/>
+        </w:rPr>
+        <w:t xml:space="preserve">, each set the way it says it is.</w:t>
+      </w:r>
+    </w:p>
+    <w:p>
+      <w:pPr>
+        <w:spacing w:line="276" w:lineRule="auto"/>
+      </w:pPr>
+    </w:p>
+    <w:p>
+      <w:pPr>
+        <w:spacing w:line="276" w:lineRule="auto"/>
+        <w:jc w:val="both"/>
+      </w:pPr>
+      <w:r>
+        <w:rPr>
+          <w:sz w:val="22"/>
+          <w:szCs w:val="22"/>
+        </w:rPr>
+        <w:t xml:space="preserve">A size is written in half points, so </w:t>
+      </w:r>
+      <w:r>
+        <w:rPr>
+          <w:sz w:val="16"/>
+          <w:szCs w:val="16"/>
+        </w:rPr>
+        <w:t xml:space="preserve">this run is 8pt (w:sz=16)</w:t>
+      </w:r>
+      <w:r>
+        <w:rPr>
+          <w:sz w:val="22"/>
+          <w:szCs w:val="22"/>
+        </w:rPr>
+        <w:t xml:space="preserve"> and </w:t>
+      </w:r>
+      <w:r>
+        <w:rPr>
+          <w:sz w:val="28"/>
+          <w:szCs w:val="28"/>
+        </w:rPr>
+        <w:t xml:space="preserve">this one is 14pt (w:sz=28)</w:t>
+      </w:r>
+      <w:r>
+        <w:rPr>
+          <w:sz w:val="22"/>
+          <w:szCs w:val="22"/>
+        </w:rPr>
+        <w:t xml:space="preserve">. A colour is six hexadecimal digits: </w:t>
+      </w:r>
+      <w:r>
+        <w:rPr>
+          <w:color w:val="1F3864"/>
+          <w:sz w:val="22"/>
+          <w:szCs w:val="22"/>
+        </w:rPr>
+        <w:t xml:space="preserve">this run is coloured 1F3864 (w:color=1F3864)</w:t>
       </w:r>
       <w:r>
         <w:rPr>
@@ -721,24 +829,29 @@
       </w:r>
       <w:r>
         <w:rPr>
-          <w:rFonts w:ascii="Georgia" w:hAnsi="Georgia" w:eastAsia="Meiryo"/>
-          <w:sz w:val="22"/>
-          <w:szCs w:val="22"/>
-        </w:rPr>
-        <w:t xml:space="preserve">this one's slots disagree, Georgia for Latin and Meiryo for East Asian text (w:rFonts w:ascii=Georgia w:eastAsia=Meiryo)</w:t>
-      </w:r>
-      <w:r>
-        <w:rPr>
-          <w:sz w:val="22"/>
-          <w:szCs w:val="22"/>
-        </w:rPr>
-        <w:t xml:space="preserve">. Every character here is Latin, so that last slot stands unused; it is what keeps a Japanese or Chinese passage out of a face with no glyphs for it.</w:t>
-      </w:r>
+          <w:sz w:val="22"/>
+          <w:szCs w:val="22"/>
+          <w:shd w:val="clear" w:color="auto" w:fill="FFF2CC"/>
+        </w:rPr>
+        <w:t xml:space="preserve">this one carries a shading fill of FFF2CC (w:shd w:fill=FFF2CC)</w:t>
+      </w:r>
+      <w:r>
+        <w:rPr>
+          <w:sz w:val="22"/>
+          <w:szCs w:val="22"/>
+        </w:rPr>
+        <w:t xml:space="preserve">.</w:t>
+      </w:r>
+    </w:p>
+    <w:p>
+      <w:pPr>
+        <w:spacing w:line="276" w:lineRule="auto"/>
+      </w:pPr>
     </w:p>
     <w:p>
       <w:pPr>
         <w:pStyle w:val="Heading2"/>
-        <w:spacing w:before="320" w:after="120"/>
+        <w:spacing w:line="276" w:lineRule="auto"/>
       </w:pPr>
       <w:r>
         <w:rPr>
@@ -748,12 +861,84 @@
           <w:sz w:val="26"/>
           <w:szCs w:val="26"/>
         </w:rPr>
-        <w:t xml:space="preserve">10. Lists</w:t>
-      </w:r>
-    </w:p>
-    <w:p>
-      <w:pPr>
-        <w:spacing w:after="140" w:line="276" w:lineRule="auto"/>
+        <w:t xml:space="preserve">10. Fonts</w:t>
+      </w:r>
+    </w:p>
+    <w:p>
+      <w:pPr>
+        <w:spacing w:line="276" w:lineRule="auto"/>
+        <w:jc w:val="both"/>
+      </w:pPr>
+      <w:r>
+        <w:rPr>
+          <w:rFonts w:ascii="Georgia" w:hAnsi="Georgia"/>
+          <w:sz w:val="22"/>
+          <w:szCs w:val="22"/>
+        </w:rPr>
+        <w:t xml:space="preserve">This run names Georgia for the Latin slots (w:rFonts w:ascii=Georgia)</w:t>
+      </w:r>
+      <w:r>
+        <w:rPr>
+          <w:sz w:val="22"/>
+          <w:szCs w:val="22"/>
+        </w:rPr>
+        <w:t xml:space="preserve">, </w:t>
+      </w:r>
+      <w:r>
+        <w:rPr>
+          <w:rFonts w:ascii="Courier New" w:hAnsi="Courier New"/>
+          <w:sz w:val="22"/>
+          <w:szCs w:val="22"/>
+        </w:rPr>
+        <w:t xml:space="preserve">this one names Courier New (w:rFonts w:ascii=Courier New)</w:t>
+      </w:r>
+      <w:r>
+        <w:rPr>
+          <w:sz w:val="22"/>
+          <w:szCs w:val="22"/>
+        </w:rPr>
+        <w:t xml:space="preserve">, and </w:t>
+      </w:r>
+      <w:r>
+        <w:rPr>
+          <w:rFonts w:ascii="Georgia" w:hAnsi="Georgia" w:eastAsia="Meiryo"/>
+          <w:sz w:val="22"/>
+          <w:szCs w:val="22"/>
+        </w:rPr>
+        <w:t xml:space="preserve">this one's slots disagree, Georgia for Latin and Meiryo for East Asian text (w:rFonts w:ascii=Georgia w:eastAsia=Meiryo)</w:t>
+      </w:r>
+      <w:r>
+        <w:rPr>
+          <w:sz w:val="22"/>
+          <w:szCs w:val="22"/>
+        </w:rPr>
+        <w:t xml:space="preserve">. Every character here is Latin, so that last slot stands unused; it is what keeps a Japanese or Chinese passage out of a face with no glyphs for it.</w:t>
+      </w:r>
+    </w:p>
+    <w:p>
+      <w:pPr>
+        <w:spacing w:line="276" w:lineRule="auto"/>
+      </w:pPr>
+    </w:p>
+    <w:p>
+      <w:pPr>
+        <w:pStyle w:val="Heading2"/>
+        <w:spacing w:line="276" w:lineRule="auto"/>
+      </w:pPr>
+      <w:r>
+        <w:rPr>
+          <w:b/>
+          <w:bCs/>
+          <w:color w:val="1F3864"/>
+          <w:sz w:val="26"/>
+          <w:szCs w:val="26"/>
+        </w:rPr>
+        <w:t xml:space="preserve">11. Lists</w:t>
+      </w:r>
+    </w:p>
+    <w:p>
+      <w:pPr>
+        <w:spacing w:line="276" w:lineRule="auto"/>
         <w:jc w:val="both"/>
       </w:pPr>
       <w:r>
@@ -763,6 +948,11 @@
         </w:rPr>
         <w:t xml:space="preserve">A marker comes from the numbering part, and a paragraph names a definition and a level inside it.</w:t>
       </w:r>
+    </w:p>
+    <w:p>
+      <w:pPr>
+        <w:spacing w:line="276" w:lineRule="auto"/>
+      </w:pPr>
     </w:p>
     <w:p>
       <w:pPr>
@@ -771,7 +961,7 @@
           <w:ilvl w:val="0"/>
           <w:numId w:val="2"/>
         </w:numPr>
-        <w:spacing w:after="80" w:line="240" w:lineRule="auto"/>
+        <w:spacing w:line="276" w:lineRule="auto"/>
         <w:ind w:left="800" w:hanging="400"/>
       </w:pPr>
       <w:r>
@@ -789,7 +979,7 @@
           <w:ilvl w:val="1"/>
           <w:numId w:val="2"/>
         </w:numPr>
-        <w:spacing w:after="80" w:line="240" w:lineRule="auto"/>
+        <w:spacing w:line="276" w:lineRule="auto"/>
         <w:ind w:left="1160" w:hanging="360"/>
       </w:pPr>
       <w:r>
@@ -807,7 +997,7 @@
           <w:ilvl w:val="0"/>
           <w:numId w:val="2"/>
         </w:numPr>
-        <w:spacing w:after="80" w:line="240" w:lineRule="auto"/>
+        <w:spacing w:line="276" w:lineRule="auto"/>
         <w:ind w:left="800" w:hanging="400"/>
       </w:pPr>
       <w:r>
@@ -817,6 +1007,11 @@
         </w:rPr>
         <w:t xml:space="preserve">This item is back at level 0, and it continues the outer count rather than starting it again.</w:t>
       </w:r>
+    </w:p>
+    <w:p>
+      <w:pPr>
+        <w:spacing w:line="276" w:lineRule="auto"/>
+      </w:pPr>
     </w:p>
     <w:p>
       <w:pPr>
@@ -825,7 +1020,7 @@
           <w:ilvl w:val="0"/>
           <w:numId w:val="1"/>
         </w:numPr>
-        <w:spacing w:after="80" w:line="240" w:lineRule="auto"/>
+        <w:spacing w:line="276" w:lineRule="auto"/>
         <w:ind w:left="800" w:hanging="400"/>
       </w:pPr>
       <w:r>
@@ -843,7 +1038,7 @@
           <w:ilvl w:val="1"/>
           <w:numId w:val="1"/>
         </w:numPr>
-        <w:spacing w:after="80" w:line="240" w:lineRule="auto"/>
+        <w:spacing w:line="276" w:lineRule="auto"/>
         <w:ind w:left="1160" w:hanging="360"/>
       </w:pPr>
       <w:r>
@@ -856,9 +1051,17 @@
     </w:p>
     <w:p>
       <w:pPr>
+        <w:spacing w:line="276" w:lineRule="auto"/>
+      </w:pPr>
+    </w:p>
+    <w:p>
+      <w:pPr>
         <w:pStyle w:val="Heading2"/>
-        <w:spacing w:before="320" w:after="120"/>
-      </w:pPr>
+        <w:spacing w:line="276" w:lineRule="auto"/>
+      </w:pPr>
+      <w:r>
+        <w:br w:type="page"/>
+      </w:r>
       <w:r>
         <w:rPr>
           <w:b/>
@@ -867,12 +1070,12 @@
           <w:sz w:val="26"/>
           <w:szCs w:val="26"/>
         </w:rPr>
-        <w:t xml:space="preserve">11. A table</w:t>
-      </w:r>
-    </w:p>
-    <w:p>
-      <w:pPr>
-        <w:spacing w:after="140" w:line="276" w:lineRule="auto"/>
+        <w:t xml:space="preserve">12. Tables</w:t>
+      </w:r>
+    </w:p>
+    <w:p>
+      <w:pPr>
+        <w:spacing w:line="276" w:lineRule="auto"/>
         <w:jc w:val="both"/>
       </w:pPr>
       <w:r>
@@ -882,6 +1085,11 @@
         </w:rPr>
         <w:t xml:space="preserve">The rules, padding and vertical placement inside a cell are read from the table. Each row below says what it shows; the last three rows include one merge across columns and one merge across rows.</w:t>
       </w:r>
+    </w:p>
+    <w:p>
+      <w:pPr>
+        <w:spacing w:line="276" w:lineRule="auto"/>
+      </w:pPr>
     </w:p>
     <w:tbl>
       <w:tblPr>
@@ -914,7 +1122,7 @@
           </w:tcPr>
           <w:p>
             <w:pPr>
-              <w:spacing w:after="0" w:line="240" w:lineRule="auto"/>
+              <w:spacing w:line="276" w:lineRule="auto"/>
             </w:pPr>
             <w:r>
               <w:rPr>
@@ -941,7 +1149,7 @@
           </w:tcPr>
           <w:p>
             <w:pPr>
-              <w:spacing w:after="0" w:line="240" w:lineRule="auto"/>
+              <w:spacing w:line="276" w:lineRule="auto"/>
             </w:pPr>
             <w:r>
               <w:rPr>
@@ -968,7 +1176,7 @@
           </w:tcPr>
           <w:p>
             <w:pPr>
-              <w:spacing w:after="0" w:line="240" w:lineRule="auto"/>
+              <w:spacing w:line="276" w:lineRule="auto"/>
               <w:jc w:val="center"/>
             </w:pPr>
             <w:r>
@@ -997,7 +1205,7 @@
           </w:tcPr>
           <w:p>
             <w:pPr>
-              <w:spacing w:after="0" w:line="240" w:lineRule="auto"/>
+              <w:spacing w:line="276" w:lineRule="auto"/>
             </w:pPr>
             <w:r>
               <w:rPr>
@@ -1020,7 +1228,7 @@
           </w:tcPr>
           <w:p>
             <w:pPr>
-              <w:spacing w:after="0" w:line="240" w:lineRule="auto"/>
+              <w:spacing w:line="276" w:lineRule="auto"/>
             </w:pPr>
             <w:r>
               <w:rPr>
@@ -1043,7 +1251,7 @@
           </w:tcPr>
           <w:p>
             <w:pPr>
-              <w:spacing w:after="0" w:line="240" w:lineRule="auto"/>
+              <w:spacing w:line="276" w:lineRule="auto"/>
               <w:jc w:val="center"/>
             </w:pPr>
             <w:r>
@@ -1069,7 +1277,7 @@
           </w:tcPr>
           <w:p>
             <w:pPr>
-              <w:spacing w:after="0" w:line="240" w:lineRule="auto"/>
+              <w:spacing w:line="276" w:lineRule="auto"/>
             </w:pPr>
             <w:r>
               <w:rPr>
@@ -1092,7 +1300,7 @@
           </w:tcPr>
           <w:p>
             <w:pPr>
-              <w:spacing w:after="0" w:line="240" w:lineRule="auto"/>
+              <w:spacing w:line="276" w:lineRule="auto"/>
             </w:pPr>
             <w:r>
               <w:rPr>
@@ -1115,7 +1323,7 @@
           </w:tcPr>
           <w:p>
             <w:pPr>
-              <w:spacing w:after="0" w:line="240" w:lineRule="auto"/>
+              <w:spacing w:line="276" w:lineRule="auto"/>
               <w:jc w:val="center"/>
             </w:pPr>
             <w:r>
@@ -1141,7 +1349,7 @@
           </w:tcPr>
           <w:p>
             <w:pPr>
-              <w:spacing w:after="0" w:line="240" w:lineRule="auto"/>
+              <w:spacing w:line="276" w:lineRule="auto"/>
             </w:pPr>
             <w:r>
               <w:rPr>
@@ -1166,7 +1374,7 @@
           </w:tcPr>
           <w:p>
             <w:pPr>
-              <w:spacing w:after="0" w:line="240" w:lineRule="auto"/>
+              <w:spacing w:line="276" w:lineRule="auto"/>
             </w:pPr>
             <w:r>
               <w:rPr>
@@ -1193,7 +1401,7 @@
           </w:tcPr>
           <w:p>
             <w:pPr>
-              <w:spacing w:after="0" w:line="240" w:lineRule="auto"/>
+              <w:spacing w:line="276" w:lineRule="auto"/>
             </w:pPr>
             <w:r>
               <w:rPr>
@@ -1216,7 +1424,7 @@
           </w:tcPr>
           <w:p>
             <w:pPr>
-              <w:spacing w:after="0" w:line="240" w:lineRule="auto"/>
+              <w:spacing w:line="276" w:lineRule="auto"/>
             </w:pPr>
             <w:r>
               <w:rPr>
@@ -1239,7 +1447,7 @@
           </w:tcPr>
           <w:p>
             <w:pPr>
-              <w:spacing w:after="0" w:line="240" w:lineRule="auto"/>
+              <w:spacing w:line="276" w:lineRule="auto"/>
               <w:jc w:val="center"/>
             </w:pPr>
             <w:r>
@@ -1267,7 +1475,7 @@
           </w:tcPr>
           <w:p>
             <w:pPr>
-              <w:spacing w:after="0" w:line="240" w:lineRule="auto"/>
+              <w:spacing w:line="276" w:lineRule="auto"/>
             </w:pPr>
           </w:p>
         </w:tc>
@@ -1283,7 +1491,7 @@
           </w:tcPr>
           <w:p>
             <w:pPr>
-              <w:spacing w:after="0" w:line="240" w:lineRule="auto"/>
+              <w:spacing w:line="276" w:lineRule="auto"/>
             </w:pPr>
             <w:r>
               <w:rPr>
@@ -1306,7 +1514,7 @@
           </w:tcPr>
           <w:p>
             <w:pPr>
-              <w:spacing w:after="0" w:line="240" w:lineRule="auto"/>
+              <w:spacing w:line="276" w:lineRule="auto"/>
               <w:jc w:val="center"/>
             </w:pPr>
             <w:r>
@@ -1322,12 +1530,14 @@
     </w:tbl>
     <w:p>
       <w:pPr>
+        <w:spacing w:line="276" w:lineRule="auto"/>
+      </w:pPr>
+    </w:p>
+    <w:p>
+      <w:pPr>
         <w:pStyle w:val="Heading2"/>
-        <w:spacing w:before="0" w:after="120"/>
-      </w:pPr>
-      <w:r>
-        <w:br w:type="page"/>
-      </w:r>
+        <w:spacing w:line="276" w:lineRule="auto"/>
+      </w:pPr>
       <w:r>
         <w:rPr>
           <w:b/>
@@ -1336,197 +1546,22 @@
           <w:sz w:val="26"/>
           <w:szCs w:val="26"/>
         </w:rPr>
-        <w:t xml:space="preserve">12. A link and a locked stretch</w:t>
-      </w:r>
-    </w:p>
-    <w:p>
-      <w:pPr>
-        <w:spacing w:after="140" w:line="276" w:lineRule="auto"/>
-        <w:jc w:val="both"/>
-      </w:pPr>
-      <w:r>
-        <w:rPr>
-          <w:sz w:val="22"/>
-          <w:szCs w:val="22"/>
-        </w:rPr>
-        <w:t xml:space="preserve">The address ending this sentence is a </w:t>
-      </w:r>
-      <w:r>
-        <w:rPr>
-          <w:b/>
-          <w:bCs/>
-          <w:sz w:val="22"/>
-          <w:szCs w:val="22"/>
-        </w:rPr>
-        <w:t xml:space="preserve">w:hyperlink</w:t>
-      </w:r>
-      <w:r>
-        <w:rPr>
-          <w:sz w:val="22"/>
-          <w:szCs w:val="22"/>
-        </w:rPr>
-        <w:t xml:space="preserve">, an r:id pointing at an External relationship, with a w:tooltip riding along untouched: </w:t>
-      </w:r>
-      <w:hyperlink r:id="rId9" w:history="1" w:tooltip="The full feature table">
-        <w:r>
-          <w:rPr>
-            <w:rStyle w:val="Hyperlink"/>
-            <w:sz w:val="22"/>
-            <w:szCs w:val="22"/>
-          </w:rPr>
-          <w:t xml:space="preserve">example.com/editor/features</w:t>
-        </w:r>
-      </w:hyperlink>
-      <w:r>
-        <w:rPr>
-          <w:sz w:val="22"/>
-          <w:szCs w:val="22"/>
-        </w:rPr>
-        <w:t xml:space="preserve">.</w:t>
-      </w:r>
-    </w:p>
-    <w:p>
-      <w:pPr>
-        <w:spacing w:after="140" w:line="276" w:lineRule="auto"/>
-        <w:jc w:val="both"/>
-      </w:pPr>
-      <w:r>
-        <w:rPr>
-          <w:sz w:val="22"/>
-          <w:szCs w:val="22"/>
-        </w:rPr>
-        <w:t xml:space="preserve">A content control can shut against editing, and </w:t>
-      </w:r>
-      <w:sdt>
-        <w:sdtPr>
-          <w:id w:val="302"/>
-          <w:lock w:val="sdtContentLocked"/>
-        </w:sdtPr>
-        <w:sdtContent>
-          <w:r>
-            <w:rPr>
-              <w:sz w:val="22"/>
-              <w:szCs w:val="22"/>
-            </w:rPr>
-            <w:t xml:space="preserve">these nine words are inside a locked content control</w:t>
-          </w:r>
-        </w:sdtContent>
-      </w:sdt>
-      <w:r>
-        <w:rPr>
-          <w:sz w:val="22"/>
-          <w:szCs w:val="22"/>
-        </w:rPr>
-        <w:t xml:space="preserve"> (w:sdt with w:lock sdtContentLocked). Every edit inside it is refused, and so is a deletion that would swallow it, while the text on either side stays editable.</w:t>
-      </w:r>
-    </w:p>
-    <w:p>
-      <w:pPr>
-        <w:pStyle w:val="Heading2"/>
-        <w:spacing w:before="320" w:after="120"/>
-      </w:pPr>
-      <w:r>
-        <w:rPr>
-          <w:b/>
-          <w:bCs/>
-          <w:color w:val="1F3864"/>
-          <w:sz w:val="26"/>
-          <w:szCs w:val="26"/>
-        </w:rPr>
-        <w:t xml:space="preserve">13. Comments, bookmarks and notes</w:t>
-      </w:r>
-    </w:p>
-    <w:p>
-      <w:pPr>
-        <w:spacing w:after="140" w:line="276" w:lineRule="auto"/>
-        <w:jc w:val="both"/>
-      </w:pPr>
-      <w:r>
-        <w:t xml:space="preserve">This paragraph has a </w:t>
-      </w:r>
-      <w:commentRangeStart w:id="0"/>
-      <w:r>
-        <w:rPr>
-          <w:shd w:val="clear" w:color="auto" w:fill="FFF2CC"/>
-        </w:rPr>
-        <w:t xml:space="preserve">commented range</w:t>
-      </w:r>
-      <w:commentRangeEnd w:id="0"/>
-      <w:r>
-        <w:commentReference w:id="0"/>
-      </w:r>
-      <w:r>
-        <w:t xml:space="preserve"> connected to a comment thread. The thread can be edited or removed from the comments panel.</w:t>
-      </w:r>
-    </w:p>
-    <w:p>
-      <w:pPr>
-        <w:spacing w:after="140" w:line="276" w:lineRule="auto"/>
-        <w:jc w:val="both"/>
-      </w:pPr>
-      <w:r>
-        <w:t xml:space="preserve">A bookmark is an invisible named range. </w:t>
-      </w:r>
-      <w:bookmarkStart w:id="1" w:name="FeatureExamples"/>
-      <w:r>
-        <w:t xml:space="preserve">This sentence is inside the FeatureExamples bookmark.</w:t>
-      </w:r>
-      <w:bookmarkEnd w:id="1"/>
-    </w:p>
-    <w:p>
-      <w:pPr>
-        <w:spacing w:after="140" w:line="276" w:lineRule="auto"/>
-        <w:jc w:val="both"/>
-      </w:pPr>
-      <w:r>
-        <w:t xml:space="preserve">This sentence carries a footnote</w:t>
-      </w:r>
-      <w:r>
-        <w:footnoteReference w:id="1"/>
-      </w:r>
-      <w:r>
-        <w:t xml:space="preserve"> and this one carries an endnote</w:t>
-      </w:r>
-      <w:r>
-        <w:endnoteReference w:id="1"/>
-      </w:r>
-      <w:r>
-        <w:t xml:space="preserve">. Their plain-text bodies are available below the document.</w:t>
-      </w:r>
-    </w:p>
-    <w:p>
-      <w:pPr>
-        <w:spacing w:after="140" w:line="276" w:lineRule="auto"/>
-        <w:jc w:val="both"/>
-      </w:pPr>
-      <w:r>
-        <w:t xml:space="preserve">The header above comes from header1.xml. The footer below comes from footer1.xml and contains a PAGE field evaluated by the preview.</w:t>
-      </w:r>
-    </w:p>
-    <w:p>
-      <w:pPr>
-        <w:pStyle w:val="Heading2"/>
-        <w:spacing w:before="320" w:after="120"/>
-      </w:pPr>
-      <w:r>
-        <w:rPr>
-          <w:b/>
-          <w:bCs/>
-          <w:color w:val="1F3864"/>
-          <w:sz w:val="26"/>
-          <w:szCs w:val="26"/>
-        </w:rPr>
-        <w:t xml:space="preserve">14. Cell alignment and padding</w:t>
-      </w:r>
-    </w:p>
-    <w:p>
-      <w:pPr>
-        <w:spacing w:after="140" w:line="276" w:lineRule="auto"/>
+        <w:t xml:space="preserve">13. Cell alignment and padding</w:t>
+      </w:r>
+    </w:p>
+    <w:p>
+      <w:pPr>
+        <w:spacing w:line="276" w:lineRule="auto"/>
         <w:jc w:val="both"/>
       </w:pPr>
       <w:r>
         <w:t xml:space="preserve">The row below is tall enough to show top, centre and bottom alignment. Its table-level cell margins provide 6 pt vertical and 9 pt horizontal padding.</w:t>
       </w:r>
+    </w:p>
+    <w:p>
+      <w:pPr>
+        <w:spacing w:line="276" w:lineRule="auto"/>
+      </w:pPr>
     </w:p>
     <w:tbl>
       <w:tblPr>
@@ -1561,7 +1596,7 @@
           </w:tcPr>
           <w:p>
             <w:pPr>
-              <w:spacing w:after="0" w:line="240" w:lineRule="auto"/>
+              <w:spacing w:line="276" w:lineRule="auto"/>
               <w:jc w:val="center"/>
             </w:pPr>
             <w:r>
@@ -1582,7 +1617,7 @@
           </w:tcPr>
           <w:p>
             <w:pPr>
-              <w:spacing w:after="0" w:line="240" w:lineRule="auto"/>
+              <w:spacing w:line="276" w:lineRule="auto"/>
               <w:jc w:val="center"/>
             </w:pPr>
             <w:r>
@@ -1603,7 +1638,7 @@
           </w:tcPr>
           <w:p>
             <w:pPr>
-              <w:spacing w:after="0" w:line="240" w:lineRule="auto"/>
+              <w:spacing w:line="276" w:lineRule="auto"/>
               <w:jc w:val="center"/>
             </w:pPr>
             <w:r>
@@ -1621,25 +1656,238 @@
     </w:tbl>
     <w:p>
       <w:pPr>
-        <w:spacing w:after="0" w:line="240" w:lineRule="auto"/>
-        <w:rPr>
-          <w:sz w:val="22"/>
-          <w:szCs w:val="22"/>
-        </w:rPr>
-      </w:pPr>
-    </w:p>
-    <w:p>
-      <w:pPr>
-        <w:spacing w:after="0" w:line="240" w:lineRule="auto"/>
-        <w:rPr>
-          <w:sz w:val="22"/>
-          <w:szCs w:val="22"/>
-        </w:rPr>
-      </w:pPr>
-    </w:p>
-    <w:p>
-      <w:pPr>
-        <w:spacing w:before="200" w:after="60"/>
+        <w:spacing w:line="276" w:lineRule="auto"/>
+      </w:pPr>
+    </w:p>
+    <w:p>
+      <w:pPr>
+        <w:pStyle w:val="Heading2"/>
+        <w:spacing w:line="276" w:lineRule="auto"/>
+      </w:pPr>
+      <w:r>
+        <w:rPr>
+          <w:b/>
+          <w:bCs/>
+          <w:color w:val="1F3864"/>
+          <w:sz w:val="26"/>
+          <w:szCs w:val="26"/>
+        </w:rPr>
+        <w:t xml:space="preserve">14. Comments, bookmarks and notes</w:t>
+      </w:r>
+    </w:p>
+    <w:p>
+      <w:pPr>
+        <w:spacing w:line="276" w:lineRule="auto"/>
+        <w:jc w:val="both"/>
+      </w:pPr>
+      <w:r>
+        <w:t xml:space="preserve">This paragraph has a </w:t>
+      </w:r>
+      <w:commentRangeStart w:id="0"/>
+      <w:r>
+        <w:rPr>
+          <w:shd w:val="clear" w:color="auto" w:fill="FFF2CC"/>
+        </w:rPr>
+        <w:t xml:space="preserve">commented range</w:t>
+      </w:r>
+      <w:commentRangeEnd w:id="0"/>
+      <w:r>
+        <w:commentReference w:id="0"/>
+      </w:r>
+      <w:r>
+        <w:t xml:space="preserve"> connected to a comment thread. The thread can be replied to, resolved and reopened, or removed altogether, from the comments panel.</w:t>
+      </w:r>
+    </w:p>
+    <w:p>
+      <w:pPr>
+        <w:spacing w:line="276" w:lineRule="auto"/>
+      </w:pPr>
+    </w:p>
+    <w:p>
+      <w:pPr>
+        <w:spacing w:line="276" w:lineRule="auto"/>
+        <w:jc w:val="both"/>
+      </w:pPr>
+      <w:r>
+        <w:t xml:space="preserve">A bookmark is an invisible named range. </w:t>
+      </w:r>
+      <w:bookmarkStart w:id="1" w:name="FeatureExamples"/>
+      <w:r>
+        <w:t xml:space="preserve">This sentence is inside the FeatureExamples bookmark.</w:t>
+      </w:r>
+      <w:bookmarkEnd w:id="1"/>
+    </w:p>
+    <w:p>
+      <w:pPr>
+        <w:spacing w:line="276" w:lineRule="auto"/>
+      </w:pPr>
+    </w:p>
+    <w:p>
+      <w:pPr>
+        <w:spacing w:line="276" w:lineRule="auto"/>
+        <w:jc w:val="both"/>
+      </w:pPr>
+      <w:r>
+        <w:t xml:space="preserve">This sentence carries a footnote</w:t>
+      </w:r>
+      <w:r>
+        <w:footnoteReference w:id="1"/>
+      </w:r>
+      <w:r>
+        <w:t xml:space="preserve"> and this one carries an endnote</w:t>
+      </w:r>
+      <w:r>
+        <w:endnoteReference w:id="1"/>
+      </w:r>
+      <w:r>
+        <w:t xml:space="preserve">. Their plain-text bodies are available below the document.</w:t>
+      </w:r>
+    </w:p>
+    <w:p>
+      <w:pPr>
+        <w:spacing w:line="276" w:lineRule="auto"/>
+      </w:pPr>
+    </w:p>
+    <w:p>
+      <w:pPr>
+        <w:spacing w:line="276" w:lineRule="auto"/>
+        <w:jc w:val="both"/>
+      </w:pPr>
+      <w:r>
+        <w:t xml:space="preserve">The header above comes from header1.xml. The footer below comes from footer1.xml and contains a PAGE field evaluated by the preview.</w:t>
+      </w:r>
+    </w:p>
+    <w:p>
+      <w:pPr>
+        <w:spacing w:line="276" w:lineRule="auto"/>
+      </w:pPr>
+    </w:p>
+    <w:p>
+      <w:pPr>
+        <w:pStyle w:val="Heading2"/>
+        <w:spacing w:line="276" w:lineRule="auto"/>
+      </w:pPr>
+      <w:r>
+        <w:br w:type="page"/>
+      </w:r>
+      <w:r>
+        <w:rPr>
+          <w:b/>
+          <w:bCs/>
+          <w:color w:val="1F3864"/>
+          <w:sz w:val="26"/>
+          <w:szCs w:val="26"/>
+        </w:rPr>
+        <w:t xml:space="preserve">15. Links and locked content</w:t>
+      </w:r>
+    </w:p>
+    <w:p>
+      <w:pPr>
+        <w:spacing w:line="276" w:lineRule="auto"/>
+        <w:jc w:val="both"/>
+      </w:pPr>
+      <w:r>
+        <w:rPr>
+          <w:sz w:val="22"/>
+          <w:szCs w:val="22"/>
+        </w:rPr>
+        <w:t xml:space="preserve">The address ending this sentence is a </w:t>
+      </w:r>
+      <w:r>
+        <w:rPr>
+          <w:b/>
+          <w:bCs/>
+          <w:sz w:val="22"/>
+          <w:szCs w:val="22"/>
+        </w:rPr>
+        <w:t xml:space="preserve">w:hyperlink</w:t>
+      </w:r>
+      <w:r>
+        <w:rPr>
+          <w:sz w:val="22"/>
+          <w:szCs w:val="22"/>
+        </w:rPr>
+        <w:t xml:space="preserve">, an r:id pointing at an External relationship, with a w:tooltip riding along untouched: </w:t>
+      </w:r>
+      <w:hyperlink r:id="rId9" w:history="1" w:tooltip="The full feature table">
+        <w:r>
+          <w:rPr>
+            <w:rStyle w:val="Hyperlink"/>
+            <w:sz w:val="22"/>
+            <w:szCs w:val="22"/>
+          </w:rPr>
+          <w:t xml:space="preserve">example.com/editor/features</w:t>
+        </w:r>
+      </w:hyperlink>
+      <w:r>
+        <w:rPr>
+          <w:sz w:val="22"/>
+          <w:szCs w:val="22"/>
+        </w:rPr>
+        <w:t xml:space="preserve">.</w:t>
+      </w:r>
+    </w:p>
+    <w:p>
+      <w:pPr>
+        <w:spacing w:line="276" w:lineRule="auto"/>
+      </w:pPr>
+    </w:p>
+    <w:p>
+      <w:pPr>
+        <w:spacing w:line="276" w:lineRule="auto"/>
+        <w:jc w:val="both"/>
+      </w:pPr>
+      <w:r>
+        <w:rPr>
+          <w:sz w:val="22"/>
+          <w:szCs w:val="22"/>
+        </w:rPr>
+        <w:t xml:space="preserve">A content control can shut against editing, and </w:t>
+      </w:r>
+      <w:sdt>
+        <w:sdtPr>
+          <w:id w:val="302"/>
+          <w:lock w:val="sdtContentLocked"/>
+        </w:sdtPr>
+        <w:sdtContent>
+          <w:r>
+            <w:rPr>
+              <w:sz w:val="22"/>
+              <w:szCs w:val="22"/>
+            </w:rPr>
+            <w:t xml:space="preserve">these nine words are inside a locked content control</w:t>
+          </w:r>
+        </w:sdtContent>
+      </w:sdt>
+      <w:r>
+        <w:rPr>
+          <w:sz w:val="22"/>
+          <w:szCs w:val="22"/>
+        </w:rPr>
+        <w:t xml:space="preserve"> (w:sdt with w:lock sdtContentLocked). Every edit inside it is refused, and so is a deletion that would swallow it, while the text on either side stays editable.</w:t>
+      </w:r>
+    </w:p>
+    <w:p>
+      <w:pPr>
+        <w:spacing w:line="276" w:lineRule="auto"/>
+        <w:rPr>
+          <w:sz w:val="22"/>
+          <w:szCs w:val="22"/>
+        </w:rPr>
+      </w:pPr>
+    </w:p>
+    <w:p>
+      <w:pPr>
+        <w:spacing w:line="276" w:lineRule="auto"/>
+        <w:rPr>
+          <w:sz w:val="22"/>
+          <w:szCs w:val="22"/>
+        </w:rPr>
+      </w:pPr>
+    </w:p>
+    <w:p>
+      <w:pPr>
+        <w:spacing w:line="276" w:lineRule="auto"/>
         <w:jc w:val="center"/>
       </w:pPr>
       <w:r>
@@ -1685,25 +1933,25 @@
     </w:p>
     <w:p>
       <w:pPr>
-        <w:spacing w:after="0" w:line="240" w:lineRule="auto"/>
-        <w:rPr>
-          <w:sz w:val="22"/>
-          <w:szCs w:val="22"/>
-        </w:rPr>
-      </w:pPr>
-    </w:p>
-    <w:p>
-      <w:pPr>
-        <w:spacing w:after="0" w:line="240" w:lineRule="auto"/>
-        <w:rPr>
-          <w:sz w:val="22"/>
-          <w:szCs w:val="22"/>
-        </w:rPr>
-      </w:pPr>
-    </w:p>
-    <w:p>
-      <w:pPr>
-        <w:spacing w:after="240"/>
+        <w:spacing w:line="276" w:lineRule="auto"/>
+        <w:rPr>
+          <w:sz w:val="22"/>
+          <w:szCs w:val="22"/>
+        </w:rPr>
+      </w:pPr>
+    </w:p>
+    <w:p>
+      <w:pPr>
+        <w:spacing w:line="276" w:lineRule="auto"/>
+        <w:rPr>
+          <w:sz w:val="22"/>
+          <w:szCs w:val="22"/>
+        </w:rPr>
+      </w:pPr>
+    </w:p>
+    <w:p>
+      <w:pPr>
+        <w:spacing w:line="276" w:lineRule="auto"/>
         <w:jc w:val="center"/>
       </w:pPr>
       <w:r>
@@ -1734,7 +1982,7 @@
   <w:comment w:id="0" w:author="Demo Author" w:initials="DA" w:date="2026-08-22T00:00:00Z">
     <w:p>
       <w:r>
-        <w:t xml:space="preserve">Comments can be created, edited and deleted.</w:t>
+        <w:t xml:space="preserve">A comment can be replied to, resolved and reopened, and it records who wrote it.</w:t>
       </w:r>
     </w:p>
   </w:comment>

</xml_diff>

<commit_message>
docs: bring the demo document up to date, and draw one line under a link (#117)
</commit_message>
<xml_diff>
--- a/__fixtures__/demo.docx
+++ b/__fixtures__/demo.docx
@@ -5,7 +5,7 @@
     <w:p>
       <w:pPr>
         <w:pStyle w:val="Heading1"/>
-        <w:spacing w:after="60"/>
+        <w:spacing w:line="276" w:lineRule="auto"/>
         <w:jc w:val="center"/>
       </w:pPr>
       <w:r>
@@ -21,7 +21,7 @@
     </w:p>
     <w:p>
       <w:pPr>
-        <w:spacing w:after="60"/>
+        <w:spacing w:line="276" w:lineRule="auto"/>
         <w:jc w:val="center"/>
       </w:pPr>
       <w:r>
@@ -37,8 +37,13 @@
     </w:p>
     <w:p>
       <w:pPr>
+        <w:spacing w:line="276" w:lineRule="auto"/>
+      </w:pPr>
+    </w:p>
+    <w:p>
+      <w:pPr>
         <w:pStyle w:val="Heading2"/>
-        <w:spacing w:before="320" w:after="120"/>
+        <w:spacing w:line="276" w:lineRule="auto"/>
       </w:pPr>
       <w:r>
         <w:rPr>
@@ -53,15 +58,15 @@
     </w:p>
     <w:p>
       <w:pPr>
-        <w:spacing w:after="140" w:line="276" w:lineRule="auto"/>
-        <w:jc w:val="both"/>
-      </w:pPr>
-      <w:r>
-        <w:rPr>
-          <w:sz w:val="22"/>
-          <w:szCs w:val="22"/>
-        </w:rPr>
-        <w:t xml:space="preserve">This set out to be a </w:t>
+        <w:spacing w:line="276" w:lineRule="auto"/>
+        <w:jc w:val="both"/>
+      </w:pPr>
+      <w:r>
+        <w:rPr>
+          <w:sz w:val="22"/>
+          <w:szCs w:val="22"/>
+        </w:rPr>
+        <w:t xml:space="preserve">This is a </w:t>
       </w:r>
       <w:r>
         <w:rPr>
@@ -77,58 +82,36 @@
           <w:sz w:val="22"/>
           <w:szCs w:val="22"/>
         </w:rPr>
-        <w:t xml:space="preserve">. It keeps to editing a document, and covers what editing one asks for: text and the formatting on it, paragraphs and the styles they name, lists, tables, inline pictures, links and locked blocks, over a real docx package.</w:t>
-      </w:r>
-    </w:p>
-    <w:p>
-      <w:pPr>
-        <w:spacing w:after="140" w:line="276" w:lineRule="auto"/>
-        <w:jc w:val="both"/>
-      </w:pPr>
-      <w:r>
-        <w:rPr>
-          <w:sz w:val="22"/>
-          <w:szCs w:val="22"/>
-        </w:rPr>
-        <w:t xml:space="preserve">The build emits the module graph one to one, so an import reaches only the module it names and what that module reads. Taking </w:t>
-      </w:r>
-      <w:r>
-        <w:rPr>
-          <w:b/>
-          <w:bCs/>
-          <w:sz w:val="22"/>
-          <w:szCs w:val="22"/>
-        </w:rPr>
-        <w:t xml:space="preserve">downloadDocx</w:t>
-      </w:r>
-      <w:r>
-        <w:rPr>
-          <w:sz w:val="22"/>
-          <w:szCs w:val="22"/>
-        </w:rPr>
-        <w:t xml:space="preserve"> out of the package costs a consumer well </w:t>
-      </w:r>
-      <w:r>
-        <w:rPr>
-          <w:b/>
-          <w:bCs/>
-          <w:sz w:val="22"/>
-          <w:szCs w:val="22"/>
-        </w:rPr>
-        <w:t xml:space="preserve">under a kilobyte</w:t>
-      </w:r>
-      <w:r>
-        <w:rPr>
-          <w:sz w:val="22"/>
-          <w:szCs w:val="22"/>
-        </w:rPr>
-        <w:t xml:space="preserve"> bundled and minified, and a test holds it there. The whole package is a couple of hundred kilobytes packed. Two packages are runtime dependencies; the editing engine and React are peers, so a host already carrying them does not pay twice.</w:t>
-      </w:r>
+        <w:t xml:space="preserve">. It keeps to editing a document, and covers what editing one asks for: text and the formatting on it, paragraphs and the styles they name, tabs, lists, tables, inline pictures, links and locked blocks, over a real docx package.</w:t>
+      </w:r>
+    </w:p>
+    <w:p>
+      <w:pPr>
+        <w:spacing w:line="276" w:lineRule="auto"/>
+      </w:pPr>
+    </w:p>
+    <w:p>
+      <w:pPr>
+        <w:spacing w:line="276" w:lineRule="auto"/>
+        <w:jc w:val="both"/>
+      </w:pPr>
+      <w:r>
+        <w:rPr>
+          <w:sz w:val="22"/>
+          <w:szCs w:val="22"/>
+        </w:rPr>
+        <w:t xml:space="preserve">The package is light to take on: two runtime dependencies, with the editing engine and React as peers, so a host already carrying them does not pay twice.</w:t>
+      </w:r>
+    </w:p>
+    <w:p>
+      <w:pPr>
+        <w:spacing w:line="276" w:lineRule="auto"/>
+      </w:pPr>
     </w:p>
     <w:p>
       <w:pPr>
         <w:pStyle w:val="Heading2"/>
-        <w:spacing w:before="320" w:after="120"/>
+        <w:spacing w:line="276" w:lineRule="auto"/>
       </w:pPr>
       <w:r>
         <w:rPr>
@@ -143,7 +126,7 @@
     </w:p>
     <w:p>
       <w:pPr>
-        <w:spacing w:after="140" w:line="276" w:lineRule="auto"/>
+        <w:spacing w:line="276" w:lineRule="auto"/>
         <w:jc w:val="both"/>
       </w:pPr>
       <w:r>
@@ -172,7 +155,12 @@
     </w:p>
     <w:p>
       <w:pPr>
-        <w:spacing w:after="140" w:line="276" w:lineRule="auto"/>
+        <w:spacing w:line="276" w:lineRule="auto"/>
+      </w:pPr>
+    </w:p>
+    <w:p>
+      <w:pPr>
+        <w:spacing w:line="276" w:lineRule="auto"/>
         <w:jc w:val="both"/>
       </w:pPr>
       <w:r>
@@ -201,8 +189,13 @@
     </w:p>
     <w:p>
       <w:pPr>
+        <w:spacing w:line="276" w:lineRule="auto"/>
+      </w:pPr>
+    </w:p>
+    <w:p>
+      <w:pPr>
         <w:pStyle w:val="Heading2"/>
-        <w:spacing w:before="320" w:after="120"/>
+        <w:spacing w:line="276" w:lineRule="auto"/>
       </w:pPr>
       <w:r>
         <w:rPr>
@@ -217,59 +210,44 @@
     </w:p>
     <w:p>
       <w:pPr>
-        <w:spacing w:after="140" w:line="276" w:lineRule="auto"/>
-        <w:jc w:val="both"/>
-      </w:pPr>
-      <w:r>
-        <w:rPr>
-          <w:sz w:val="22"/>
-          <w:szCs w:val="22"/>
-        </w:rPr>
-        <w:t xml:space="preserve">Comments can be viewed, created, edited and deleted. Footnote and endnote references and their plain-text bodies are shown, and the first section's header and footer are previewed with supported page fields.</w:t>
-      </w:r>
-    </w:p>
-    <w:p>
-      <w:pPr>
-        <w:spacing w:after="140" w:line="276" w:lineRule="auto"/>
-        <w:jc w:val="both"/>
-      </w:pPr>
-      <w:r>
-        <w:rPr>
-          <w:sz w:val="22"/>
-          <w:szCs w:val="22"/>
-        </w:rPr>
-        <w:t xml:space="preserve">Bookmarks stay invisible and attached to their document ranges. Tracked changes, unsupported fields, floating pictures, charts, text boxes and nested structures stay on the preservation path. Page guides and header or footer placement are visual approximations rather than print pagination.</w:t>
-      </w:r>
-    </w:p>
-    <w:p>
-      <w:pPr>
-        <w:shd w:val="clear" w:color="auto" w:fill="FFF2CC"/>
-        <w:spacing w:before="200" w:after="200" w:line="240" w:lineRule="auto"/>
-        <w:ind w:left="140" w:right="140"/>
-      </w:pPr>
-      <w:r>
-        <w:rPr>
-          <w:b/>
-          <w:bCs/>
-          <w:color w:val="7F4E14"/>
-          <w:sz w:val="22"/>
-          <w:szCs w:val="22"/>
-        </w:rPr>
-        <w:t xml:space="preserve">Note. </w:t>
-      </w:r>
-      <w:r>
-        <w:rPr>
-          <w:color w:val="7F4E14"/>
-          <w:sz w:val="22"/>
-          <w:szCs w:val="22"/>
-        </w:rPr>
-        <w:t xml:space="preserve">Two limits are met more often than the rest. Pasted text arrives as characters and its formatting is dropped. And an image over 16 MiB is preserved rather than drawn.</w:t>
-      </w:r>
+        <w:spacing w:line="276" w:lineRule="auto"/>
+        <w:jc w:val="both"/>
+      </w:pPr>
+      <w:r>
+        <w:rPr>
+          <w:sz w:val="22"/>
+          <w:szCs w:val="22"/>
+        </w:rPr>
+        <w:t xml:space="preserve">The editor opens read-only, for commenting, or for editing, and whichever way it is open the document goes back out as a docx. Comments come with their threads and the author on each, and footnotes, endnotes, headers and footers are shown as the document wrote them. Text pasted in keeps the formatting, links and lists it came with.</w:t>
+      </w:r>
+    </w:p>
+    <w:p>
+      <w:pPr>
+        <w:spacing w:line="276" w:lineRule="auto"/>
+      </w:pPr>
+    </w:p>
+    <w:p>
+      <w:pPr>
+        <w:spacing w:line="276" w:lineRule="auto"/>
+        <w:jc w:val="both"/>
+      </w:pPr>
+      <w:r>
+        <w:rPr>
+          <w:sz w:val="22"/>
+          <w:szCs w:val="22"/>
+        </w:rPr>
+        <w:t xml:space="preserve">What the editor does not model is kept rather than dropped, and the text around it stays editable. The page marks are a guide to the layout rather than print pagination.</w:t>
+      </w:r>
+    </w:p>
+    <w:p>
+      <w:pPr>
+        <w:spacing w:line="276" w:lineRule="auto"/>
+      </w:pPr>
     </w:p>
     <w:p>
       <w:pPr>
         <w:pStyle w:val="Heading2"/>
-        <w:spacing w:before="320" w:after="120"/>
+        <w:spacing w:line="276" w:lineRule="auto"/>
       </w:pPr>
       <w:r>
         <w:rPr>
@@ -284,7 +262,7 @@
     </w:p>
     <w:p>
       <w:pPr>
-        <w:spacing w:after="140" w:line="276" w:lineRule="auto"/>
+        <w:spacing w:line="276" w:lineRule="auto"/>
         <w:jc w:val="both"/>
       </w:pPr>
       <w:r>
@@ -298,7 +276,7 @@
     <w:p>
       <w:pPr>
         <w:pStyle w:val="Heading1"/>
-        <w:spacing w:before="0" w:after="160"/>
+        <w:spacing w:line="276" w:lineRule="auto"/>
       </w:pPr>
       <w:r>
         <w:br w:type="page"/>
@@ -316,7 +294,7 @@
     </w:p>
     <w:p>
       <w:pPr>
-        <w:spacing w:after="140" w:line="276" w:lineRule="auto"/>
+        <w:spacing w:line="276" w:lineRule="auto"/>
         <w:jc w:val="both"/>
       </w:pPr>
       <w:r>
@@ -329,8 +307,13 @@
     </w:p>
     <w:p>
       <w:pPr>
+        <w:spacing w:line="276" w:lineRule="auto"/>
+      </w:pPr>
+    </w:p>
+    <w:p>
+      <w:pPr>
         <w:pStyle w:val="Heading2"/>
-        <w:spacing w:before="320" w:after="120"/>
+        <w:spacing w:line="276" w:lineRule="auto"/>
       </w:pPr>
       <w:r>
         <w:rPr>
@@ -345,7 +328,7 @@
     </w:p>
     <w:p>
       <w:pPr>
-        <w:spacing w:after="140" w:line="276" w:lineRule="auto"/>
+        <w:spacing w:line="276" w:lineRule="auto"/>
         <w:jc w:val="left"/>
       </w:pPr>
       <w:r>
@@ -358,7 +341,12 @@
     </w:p>
     <w:p>
       <w:pPr>
-        <w:spacing w:after="140" w:line="276" w:lineRule="auto"/>
+        <w:spacing w:line="276" w:lineRule="auto"/>
+      </w:pPr>
+    </w:p>
+    <w:p>
+      <w:pPr>
+        <w:spacing w:line="276" w:lineRule="auto"/>
         <w:jc w:val="center"/>
       </w:pPr>
       <w:r>
@@ -371,7 +359,12 @@
     </w:p>
     <w:p>
       <w:pPr>
-        <w:spacing w:after="140" w:line="276" w:lineRule="auto"/>
+        <w:spacing w:line="276" w:lineRule="auto"/>
+      </w:pPr>
+    </w:p>
+    <w:p>
+      <w:pPr>
+        <w:spacing w:line="276" w:lineRule="auto"/>
         <w:jc w:val="right"/>
       </w:pPr>
       <w:r>
@@ -384,7 +377,12 @@
     </w:p>
     <w:p>
       <w:pPr>
-        <w:spacing w:after="140" w:line="276" w:lineRule="auto"/>
+        <w:spacing w:line="276" w:lineRule="auto"/>
+      </w:pPr>
+    </w:p>
+    <w:p>
+      <w:pPr>
+        <w:spacing w:line="276" w:lineRule="auto"/>
         <w:jc w:val="both"/>
       </w:pPr>
       <w:r>
@@ -397,8 +395,13 @@
     </w:p>
     <w:p>
       <w:pPr>
+        <w:spacing w:line="276" w:lineRule="auto"/>
+      </w:pPr>
+    </w:p>
+    <w:p>
+      <w:pPr>
         <w:pStyle w:val="Heading2"/>
-        <w:spacing w:before="320" w:after="120"/>
+        <w:spacing w:line="276" w:lineRule="auto"/>
       </w:pPr>
       <w:r>
         <w:rPr>
@@ -413,7 +416,7 @@
     </w:p>
     <w:p>
       <w:pPr>
-        <w:spacing w:after="140" w:line="276" w:lineRule="auto"/>
+        <w:spacing w:line="276" w:lineRule="auto"/>
         <w:jc w:val="both"/>
       </w:pPr>
       <w:r>
@@ -426,7 +429,12 @@
     </w:p>
     <w:p>
       <w:pPr>
-        <w:spacing w:after="140" w:line="276" w:lineRule="auto"/>
+        <w:spacing w:line="276" w:lineRule="auto"/>
+      </w:pPr>
+    </w:p>
+    <w:p>
+      <w:pPr>
+        <w:spacing w:line="276" w:lineRule="auto"/>
         <w:ind w:left="720"/>
         <w:jc w:val="both"/>
       </w:pPr>
@@ -440,8 +448,13 @@
     </w:p>
     <w:p>
       <w:pPr>
+        <w:spacing w:line="276" w:lineRule="auto"/>
+      </w:pPr>
+    </w:p>
+    <w:p>
+      <w:pPr>
         <w:pStyle w:val="Heading2"/>
-        <w:spacing w:before="320" w:after="120"/>
+        <w:spacing w:line="276" w:lineRule="auto"/>
       </w:pPr>
       <w:r>
         <w:rPr>
@@ -456,7 +469,7 @@
     </w:p>
     <w:p>
       <w:pPr>
-        <w:spacing w:after="140" w:line="276" w:lineRule="auto"/>
+        <w:spacing w:line="276" w:lineRule="auto"/>
         <w:jc w:val="both"/>
       </w:pPr>
       <w:r>
@@ -469,7 +482,12 @@
     </w:p>
     <w:p>
       <w:pPr>
-        <w:spacing w:after="140" w:line="240" w:lineRule="auto"/>
+        <w:spacing w:line="276" w:lineRule="auto"/>
+      </w:pPr>
+    </w:p>
+    <w:p>
+      <w:pPr>
+        <w:spacing w:line="240" w:lineRule="auto"/>
         <w:jc w:val="both"/>
       </w:pPr>
       <w:r>
@@ -482,34 +500,31 @@
     </w:p>
     <w:p>
       <w:pPr>
-        <w:spacing w:after="140" w:line="276" w:lineRule="auto"/>
-        <w:jc w:val="both"/>
-      </w:pPr>
-      <w:r>
-        <w:rPr>
-          <w:sz w:val="22"/>
-          <w:szCs w:val="22"/>
-        </w:rPr>
-        <w:t xml:space="preserve">This paragraph is set at 1.15 lines (w:line=276), the spacing the prose in the first half uses: close enough to single not to draw attention, open enough to read a long paragraph in.</w:t>
-      </w:r>
-    </w:p>
-    <w:p>
-      <w:pPr>
-        <w:spacing w:after="140" w:line="480" w:lineRule="auto"/>
-        <w:jc w:val="both"/>
-      </w:pPr>
-      <w:r>
-        <w:rPr>
-          <w:sz w:val="22"/>
-          <w:szCs w:val="22"/>
-        </w:rPr>
-        <w:t xml:space="preserve">This paragraph is double spaced (w:line=480). Twice the height of a line goes to every line, which makes the setting unmistakable beside the two above.</w:t>
-      </w:r>
+        <w:spacing w:line="276" w:lineRule="auto"/>
+      </w:pPr>
+    </w:p>
+    <w:p>
+      <w:pPr>
+        <w:spacing w:line="276" w:lineRule="auto"/>
+        <w:jc w:val="both"/>
+      </w:pPr>
+      <w:r>
+        <w:rPr>
+          <w:sz w:val="22"/>
+          <w:szCs w:val="22"/>
+        </w:rPr>
+        <w:t xml:space="preserve">This paragraph is set at 1.15 lines (w:line=276), the spacing the rest of this document uses: close enough to single not to draw attention, open enough to read a long paragraph in.</w:t>
+      </w:r>
+    </w:p>
+    <w:p>
+      <w:pPr>
+        <w:spacing w:line="276" w:lineRule="auto"/>
+      </w:pPr>
     </w:p>
     <w:p>
       <w:pPr>
         <w:pStyle w:val="Heading2"/>
-        <w:spacing w:before="320" w:after="120"/>
+        <w:spacing w:line="276" w:lineRule="auto"/>
       </w:pPr>
       <w:r>
         <w:rPr>
@@ -519,160 +534,153 @@
           <w:sz w:val="26"/>
           <w:szCs w:val="26"/>
         </w:rPr>
-        <w:t xml:space="preserve">8. Run formatting</w:t>
-      </w:r>
-    </w:p>
-    <w:p>
-      <w:pPr>
-        <w:spacing w:after="140" w:line="276" w:lineRule="auto"/>
-        <w:jc w:val="both"/>
-      </w:pPr>
-      <w:r>
-        <w:rPr>
-          <w:sz w:val="22"/>
-          <w:szCs w:val="22"/>
-        </w:rPr>
-        <w:t xml:space="preserve">Formatting belongs to the run, so one sentence can carry several: this is </w:t>
-      </w:r>
-      <w:r>
-        <w:rPr>
-          <w:b/>
-          <w:bCs/>
-          <w:sz w:val="22"/>
-          <w:szCs w:val="22"/>
-        </w:rPr>
-        <w:t xml:space="preserve">bold</w:t>
-      </w:r>
-      <w:r>
-        <w:rPr>
-          <w:sz w:val="22"/>
-          <w:szCs w:val="22"/>
-        </w:rPr>
-        <w:t xml:space="preserve">, this is </w:t>
-      </w:r>
-      <w:r>
-        <w:rPr>
-          <w:i/>
-          <w:iCs/>
-          <w:sz w:val="22"/>
-          <w:szCs w:val="22"/>
-        </w:rPr>
-        <w:t xml:space="preserve">italic</w:t>
-      </w:r>
-      <w:r>
-        <w:rPr>
-          <w:sz w:val="22"/>
-          <w:szCs w:val="22"/>
-        </w:rPr>
-        <w:t xml:space="preserve">, this is </w:t>
-      </w:r>
-      <w:r>
-        <w:rPr>
-          <w:sz w:val="22"/>
-          <w:szCs w:val="22"/>
-          <w:u w:val="single"/>
-        </w:rPr>
-        <w:t xml:space="preserve">underlined</w:t>
-      </w:r>
-      <w:r>
-        <w:rPr>
-          <w:sz w:val="22"/>
-          <w:szCs w:val="22"/>
-        </w:rPr>
-        <w:t xml:space="preserve"> and </w:t>
-      </w:r>
-      <w:r>
-        <w:rPr>
-          <w:strike/>
-          <w:sz w:val="22"/>
-          <w:szCs w:val="22"/>
-        </w:rPr>
-        <w:t xml:space="preserve">this stretch is struck through</w:t>
-      </w:r>
-      <w:r>
-        <w:rPr>
-          <w:sz w:val="22"/>
-          <w:szCs w:val="22"/>
-        </w:rPr>
-        <w:t xml:space="preserve">, each set the way it says it is.</w:t>
-      </w:r>
-    </w:p>
-    <w:p>
-      <w:pPr>
-        <w:spacing w:after="140" w:line="276" w:lineRule="auto"/>
-        <w:jc w:val="both"/>
-      </w:pPr>
-      <w:r>
-        <w:rPr>
-          <w:sz w:val="22"/>
-          <w:szCs w:val="22"/>
-        </w:rPr>
-        <w:t xml:space="preserve">A size is written in half points, so </w:t>
-      </w:r>
-      <w:r>
-        <w:rPr>
-          <w:sz w:val="16"/>
-          <w:szCs w:val="16"/>
-        </w:rPr>
-        <w:t xml:space="preserve">this run is 8pt (w:sz=16)</w:t>
-      </w:r>
-      <w:r>
-        <w:rPr>
-          <w:sz w:val="22"/>
-          <w:szCs w:val="22"/>
-        </w:rPr>
-        <w:t xml:space="preserve"> and </w:t>
-      </w:r>
-      <w:r>
-        <w:rPr>
-          <w:sz w:val="28"/>
-          <w:szCs w:val="28"/>
-        </w:rPr>
-        <w:t xml:space="preserve">this one is 14pt (w:sz=28)</w:t>
-      </w:r>
-      <w:r>
-        <w:rPr>
-          <w:sz w:val="22"/>
-          <w:szCs w:val="22"/>
-        </w:rPr>
-        <w:t xml:space="preserve">. A colour is six hexadecimal digits: </w:t>
-      </w:r>
-      <w:r>
-        <w:rPr>
-          <w:color w:val="1F3864"/>
-          <w:sz w:val="22"/>
-          <w:szCs w:val="22"/>
-        </w:rPr>
-        <w:t xml:space="preserve">this run is coloured 1F3864 (w:color=1F3864)</w:t>
-      </w:r>
-      <w:r>
-        <w:rPr>
-          <w:sz w:val="22"/>
-          <w:szCs w:val="22"/>
-        </w:rPr>
-        <w:t xml:space="preserve">, and </w:t>
-      </w:r>
-      <w:r>
-        <w:rPr>
-          <w:sz w:val="22"/>
-          <w:szCs w:val="22"/>
-          <w:shd w:val="clear" w:color="auto" w:fill="FFF2CC"/>
-        </w:rPr>
-        <w:t xml:space="preserve">this one carries a shading fill of FFF2CC (w:shd w:fill=FFF2CC)</w:t>
-      </w:r>
-      <w:r>
-        <w:rPr>
-          <w:sz w:val="22"/>
-          <w:szCs w:val="22"/>
-        </w:rPr>
-        <w:t xml:space="preserve">.</w:t>
-      </w:r>
+        <w:t xml:space="preserve">8. Tabs</w:t>
+      </w:r>
+    </w:p>
+    <w:p>
+      <w:pPr>
+        <w:spacing w:line="276" w:lineRule="auto"/>
+        <w:jc w:val="both"/>
+      </w:pPr>
+      <w:r>
+        <w:rPr>
+          <w:sz w:val="22"/>
+          <w:szCs w:val="22"/>
+        </w:rPr>
+        <w:t xml:space="preserve">A tab jumps to the next stop its paragraph sets (w:tabs), and to the next multiple of the interval the document carries where it sets none (w:defaultTabStop, 720 twips).</w:t>
+      </w:r>
+    </w:p>
+    <w:p>
+      <w:pPr>
+        <w:spacing w:line="276" w:lineRule="auto"/>
+      </w:pPr>
+    </w:p>
+    <w:p>
+      <w:pPr>
+        <w:tabs>
+          <w:tab w:val="left" w:pos="2400"/>
+          <w:tab w:val="center" w:pos="5400"/>
+          <w:tab w:val="right" w:pos="9026"/>
+        </w:tabs>
+        <w:spacing w:line="276" w:lineRule="auto"/>
+      </w:pPr>
+      <w:r>
+        <w:rPr>
+          <w:sz w:val="22"/>
+          <w:szCs w:val="22"/>
+        </w:rPr>
+        <w:t xml:space="preserve">Three stops</w:t>
+      </w:r>
+      <w:r>
+        <w:rPr>
+          <w:sz w:val="22"/>
+          <w:szCs w:val="22"/>
+        </w:rPr>
+        <w:tab/>
+      </w:r>
+      <w:r>
+        <w:rPr>
+          <w:sz w:val="22"/>
+          <w:szCs w:val="22"/>
+        </w:rPr>
+        <w:t xml:space="preserve">left at 2400</w:t>
+      </w:r>
+      <w:r>
+        <w:rPr>
+          <w:sz w:val="22"/>
+          <w:szCs w:val="22"/>
+        </w:rPr>
+        <w:tab/>
+      </w:r>
+      <w:r>
+        <w:rPr>
+          <w:sz w:val="22"/>
+          <w:szCs w:val="22"/>
+        </w:rPr>
+        <w:t xml:space="preserve">centred at 5400</w:t>
+      </w:r>
+      <w:r>
+        <w:rPr>
+          <w:sz w:val="22"/>
+          <w:szCs w:val="22"/>
+        </w:rPr>
+        <w:tab/>
+      </w:r>
+      <w:r>
+        <w:rPr>
+          <w:sz w:val="22"/>
+          <w:szCs w:val="22"/>
+        </w:rPr>
+        <w:t xml:space="preserve">right at 9026</w:t>
+      </w:r>
+    </w:p>
+    <w:p>
+      <w:pPr>
+        <w:spacing w:line="276" w:lineRule="auto"/>
+      </w:pPr>
+      <w:r>
+        <w:rPr>
+          <w:sz w:val="22"/>
+          <w:szCs w:val="22"/>
+        </w:rPr>
+        <w:t xml:space="preserve">No stops</w:t>
+      </w:r>
+      <w:r>
+        <w:rPr>
+          <w:sz w:val="22"/>
+          <w:szCs w:val="22"/>
+        </w:rPr>
+        <w:tab/>
+      </w:r>
+      <w:r>
+        <w:rPr>
+          <w:sz w:val="22"/>
+          <w:szCs w:val="22"/>
+        </w:rPr>
+        <w:t xml:space="preserve">so each</w:t>
+      </w:r>
+      <w:r>
+        <w:rPr>
+          <w:sz w:val="22"/>
+          <w:szCs w:val="22"/>
+        </w:rPr>
+        <w:tab/>
+      </w:r>
+      <w:r>
+        <w:rPr>
+          <w:sz w:val="22"/>
+          <w:szCs w:val="22"/>
+        </w:rPr>
+        <w:t xml:space="preserve">tab falls on</w:t>
+      </w:r>
+      <w:r>
+        <w:rPr>
+          <w:sz w:val="22"/>
+          <w:szCs w:val="22"/>
+        </w:rPr>
+        <w:tab/>
+      </w:r>
+      <w:r>
+        <w:rPr>
+          <w:sz w:val="22"/>
+          <w:szCs w:val="22"/>
+        </w:rPr>
+        <w:t xml:space="preserve">the automatic interval.</w:t>
+      </w:r>
+    </w:p>
+    <w:p>
+      <w:pPr>
+        <w:spacing w:line="276" w:lineRule="auto"/>
+      </w:pPr>
     </w:p>
     <w:p>
       <w:pPr>
         <w:pStyle w:val="Heading2"/>
-        <w:spacing w:before="320" w:after="120"/>
-      </w:pPr>
+        <w:spacing w:line="276" w:lineRule="auto"/>
+      </w:pPr>
+      <w:r>
+        <w:br w:type="page"/>
+      </w:r>
       <w:r>
         <w:rPr>
           <w:b/>
@@ -681,36 +689,136 @@
           <w:sz w:val="26"/>
           <w:szCs w:val="26"/>
         </w:rPr>
-        <w:t xml:space="preserve">9. Fonts</w:t>
-      </w:r>
-    </w:p>
-    <w:p>
-      <w:pPr>
-        <w:spacing w:after="140" w:line="276" w:lineRule="auto"/>
-        <w:jc w:val="both"/>
-      </w:pPr>
-      <w:r>
-        <w:rPr>
-          <w:rFonts w:ascii="Georgia" w:hAnsi="Georgia"/>
-          <w:sz w:val="22"/>
-          <w:szCs w:val="22"/>
-        </w:rPr>
-        <w:t xml:space="preserve">This run names Georgia for the Latin slots (w:rFonts w:ascii=Georgia)</w:t>
-      </w:r>
-      <w:r>
-        <w:rPr>
-          <w:sz w:val="22"/>
-          <w:szCs w:val="22"/>
-        </w:rPr>
-        <w:t xml:space="preserve">, </w:t>
-      </w:r>
-      <w:r>
-        <w:rPr>
-          <w:rFonts w:ascii="Courier New" w:hAnsi="Courier New"/>
-          <w:sz w:val="22"/>
-          <w:szCs w:val="22"/>
-        </w:rPr>
-        <w:t xml:space="preserve">this one names Courier New (w:rFonts w:ascii=Courier New)</w:t>
+        <w:t xml:space="preserve">9. Character formatting</w:t>
+      </w:r>
+    </w:p>
+    <w:p>
+      <w:pPr>
+        <w:spacing w:line="276" w:lineRule="auto"/>
+        <w:jc w:val="both"/>
+      </w:pPr>
+      <w:r>
+        <w:rPr>
+          <w:sz w:val="22"/>
+          <w:szCs w:val="22"/>
+        </w:rPr>
+        <w:t xml:space="preserve">Formatting belongs to the run, so one sentence can carry several: this is </w:t>
+      </w:r>
+      <w:r>
+        <w:rPr>
+          <w:b/>
+          <w:bCs/>
+          <w:sz w:val="22"/>
+          <w:szCs w:val="22"/>
+        </w:rPr>
+        <w:t xml:space="preserve">bold</w:t>
+      </w:r>
+      <w:r>
+        <w:rPr>
+          <w:sz w:val="22"/>
+          <w:szCs w:val="22"/>
+        </w:rPr>
+        <w:t xml:space="preserve">, this is </w:t>
+      </w:r>
+      <w:r>
+        <w:rPr>
+          <w:i/>
+          <w:iCs/>
+          <w:sz w:val="22"/>
+          <w:szCs w:val="22"/>
+        </w:rPr>
+        <w:t xml:space="preserve">italic</w:t>
+      </w:r>
+      <w:r>
+        <w:rPr>
+          <w:sz w:val="22"/>
+          <w:szCs w:val="22"/>
+        </w:rPr>
+        <w:t xml:space="preserve">, this is </w:t>
+      </w:r>
+      <w:r>
+        <w:rPr>
+          <w:sz w:val="22"/>
+          <w:szCs w:val="22"/>
+          <w:u w:val="single"/>
+        </w:rPr>
+        <w:t xml:space="preserve">underlined</w:t>
+      </w:r>
+      <w:r>
+        <w:rPr>
+          <w:sz w:val="22"/>
+          <w:szCs w:val="22"/>
+        </w:rPr>
+        <w:t xml:space="preserve"> and </w:t>
+      </w:r>
+      <w:r>
+        <w:rPr>
+          <w:strike/>
+          <w:sz w:val="22"/>
+          <w:szCs w:val="22"/>
+        </w:rPr>
+        <w:t xml:space="preserve">this stretch is struck through</w:t>
+      </w:r>
+      <w:r>
+        <w:rPr>
+          <w:sz w:val="22"/>
+          <w:szCs w:val="22"/>
+        </w:rPr>
+        <w:t xml:space="preserve">, each set the way it says it is.</w:t>
+      </w:r>
+    </w:p>
+    <w:p>
+      <w:pPr>
+        <w:spacing w:line="276" w:lineRule="auto"/>
+      </w:pPr>
+    </w:p>
+    <w:p>
+      <w:pPr>
+        <w:spacing w:line="276" w:lineRule="auto"/>
+        <w:jc w:val="both"/>
+      </w:pPr>
+      <w:r>
+        <w:rPr>
+          <w:sz w:val="22"/>
+          <w:szCs w:val="22"/>
+        </w:rPr>
+        <w:t xml:space="preserve">A size is written in half points, so </w:t>
+      </w:r>
+      <w:r>
+        <w:rPr>
+          <w:sz w:val="16"/>
+          <w:szCs w:val="16"/>
+        </w:rPr>
+        <w:t xml:space="preserve">this run is 8pt (w:sz=16)</w:t>
+      </w:r>
+      <w:r>
+        <w:rPr>
+          <w:sz w:val="22"/>
+          <w:szCs w:val="22"/>
+        </w:rPr>
+        <w:t xml:space="preserve"> and </w:t>
+      </w:r>
+      <w:r>
+        <w:rPr>
+          <w:sz w:val="28"/>
+          <w:szCs w:val="28"/>
+        </w:rPr>
+        <w:t xml:space="preserve">this one is 14pt (w:sz=28)</w:t>
+      </w:r>
+      <w:r>
+        <w:rPr>
+          <w:sz w:val="22"/>
+          <w:szCs w:val="22"/>
+        </w:rPr>
+        <w:t xml:space="preserve">. A colour is six hexadecimal digits: </w:t>
+      </w:r>
+      <w:r>
+        <w:rPr>
+          <w:color w:val="1F3864"/>
+          <w:sz w:val="22"/>
+          <w:szCs w:val="22"/>
+        </w:rPr>
+        <w:t xml:space="preserve">this run is coloured 1F3864 (w:color=1F3864)</w:t>
       </w:r>
       <w:r>
         <w:rPr>
@@ -721,24 +829,29 @@
       </w:r>
       <w:r>
         <w:rPr>
-          <w:rFonts w:ascii="Georgia" w:hAnsi="Georgia" w:eastAsia="Meiryo"/>
-          <w:sz w:val="22"/>
-          <w:szCs w:val="22"/>
-        </w:rPr>
-        <w:t xml:space="preserve">this one's slots disagree, Georgia for Latin and Meiryo for East Asian text (w:rFonts w:ascii=Georgia w:eastAsia=Meiryo)</w:t>
-      </w:r>
-      <w:r>
-        <w:rPr>
-          <w:sz w:val="22"/>
-          <w:szCs w:val="22"/>
-        </w:rPr>
-        <w:t xml:space="preserve">. Every character here is Latin, so that last slot stands unused; it is what keeps a Japanese or Chinese passage out of a face with no glyphs for it.</w:t>
-      </w:r>
+          <w:sz w:val="22"/>
+          <w:szCs w:val="22"/>
+          <w:shd w:val="clear" w:color="auto" w:fill="FFF2CC"/>
+        </w:rPr>
+        <w:t xml:space="preserve">this one carries a shading fill of FFF2CC (w:shd w:fill=FFF2CC)</w:t>
+      </w:r>
+      <w:r>
+        <w:rPr>
+          <w:sz w:val="22"/>
+          <w:szCs w:val="22"/>
+        </w:rPr>
+        <w:t xml:space="preserve">.</w:t>
+      </w:r>
+    </w:p>
+    <w:p>
+      <w:pPr>
+        <w:spacing w:line="276" w:lineRule="auto"/>
+      </w:pPr>
     </w:p>
     <w:p>
       <w:pPr>
         <w:pStyle w:val="Heading2"/>
-        <w:spacing w:before="320" w:after="120"/>
+        <w:spacing w:line="276" w:lineRule="auto"/>
       </w:pPr>
       <w:r>
         <w:rPr>
@@ -748,12 +861,84 @@
           <w:sz w:val="26"/>
           <w:szCs w:val="26"/>
         </w:rPr>
-        <w:t xml:space="preserve">10. Lists</w:t>
-      </w:r>
-    </w:p>
-    <w:p>
-      <w:pPr>
-        <w:spacing w:after="140" w:line="276" w:lineRule="auto"/>
+        <w:t xml:space="preserve">10. Fonts</w:t>
+      </w:r>
+    </w:p>
+    <w:p>
+      <w:pPr>
+        <w:spacing w:line="276" w:lineRule="auto"/>
+        <w:jc w:val="both"/>
+      </w:pPr>
+      <w:r>
+        <w:rPr>
+          <w:rFonts w:ascii="Georgia" w:hAnsi="Georgia"/>
+          <w:sz w:val="22"/>
+          <w:szCs w:val="22"/>
+        </w:rPr>
+        <w:t xml:space="preserve">This run names Georgia for the Latin slots (w:rFonts w:ascii=Georgia)</w:t>
+      </w:r>
+      <w:r>
+        <w:rPr>
+          <w:sz w:val="22"/>
+          <w:szCs w:val="22"/>
+        </w:rPr>
+        <w:t xml:space="preserve">, </w:t>
+      </w:r>
+      <w:r>
+        <w:rPr>
+          <w:rFonts w:ascii="Courier New" w:hAnsi="Courier New"/>
+          <w:sz w:val="22"/>
+          <w:szCs w:val="22"/>
+        </w:rPr>
+        <w:t xml:space="preserve">this one names Courier New (w:rFonts w:ascii=Courier New)</w:t>
+      </w:r>
+      <w:r>
+        <w:rPr>
+          <w:sz w:val="22"/>
+          <w:szCs w:val="22"/>
+        </w:rPr>
+        <w:t xml:space="preserve">, and </w:t>
+      </w:r>
+      <w:r>
+        <w:rPr>
+          <w:rFonts w:ascii="Georgia" w:hAnsi="Georgia" w:eastAsia="Meiryo"/>
+          <w:sz w:val="22"/>
+          <w:szCs w:val="22"/>
+        </w:rPr>
+        <w:t xml:space="preserve">this one's slots disagree, Georgia for Latin and Meiryo for East Asian text (w:rFonts w:ascii=Georgia w:eastAsia=Meiryo)</w:t>
+      </w:r>
+      <w:r>
+        <w:rPr>
+          <w:sz w:val="22"/>
+          <w:szCs w:val="22"/>
+        </w:rPr>
+        <w:t xml:space="preserve">. Every character here is Latin, so that last slot stands unused; it is what keeps a Japanese or Chinese passage out of a face with no glyphs for it.</w:t>
+      </w:r>
+    </w:p>
+    <w:p>
+      <w:pPr>
+        <w:spacing w:line="276" w:lineRule="auto"/>
+      </w:pPr>
+    </w:p>
+    <w:p>
+      <w:pPr>
+        <w:pStyle w:val="Heading2"/>
+        <w:spacing w:line="276" w:lineRule="auto"/>
+      </w:pPr>
+      <w:r>
+        <w:rPr>
+          <w:b/>
+          <w:bCs/>
+          <w:color w:val="1F3864"/>
+          <w:sz w:val="26"/>
+          <w:szCs w:val="26"/>
+        </w:rPr>
+        <w:t xml:space="preserve">11. Lists</w:t>
+      </w:r>
+    </w:p>
+    <w:p>
+      <w:pPr>
+        <w:spacing w:line="276" w:lineRule="auto"/>
         <w:jc w:val="both"/>
       </w:pPr>
       <w:r>
@@ -763,6 +948,11 @@
         </w:rPr>
         <w:t xml:space="preserve">A marker comes from the numbering part, and a paragraph names a definition and a level inside it.</w:t>
       </w:r>
+    </w:p>
+    <w:p>
+      <w:pPr>
+        <w:spacing w:line="276" w:lineRule="auto"/>
+      </w:pPr>
     </w:p>
     <w:p>
       <w:pPr>
@@ -771,7 +961,7 @@
           <w:ilvl w:val="0"/>
           <w:numId w:val="2"/>
         </w:numPr>
-        <w:spacing w:after="80" w:line="240" w:lineRule="auto"/>
+        <w:spacing w:line="276" w:lineRule="auto"/>
         <w:ind w:left="800" w:hanging="400"/>
       </w:pPr>
       <w:r>
@@ -789,7 +979,7 @@
           <w:ilvl w:val="1"/>
           <w:numId w:val="2"/>
         </w:numPr>
-        <w:spacing w:after="80" w:line="240" w:lineRule="auto"/>
+        <w:spacing w:line="276" w:lineRule="auto"/>
         <w:ind w:left="1160" w:hanging="360"/>
       </w:pPr>
       <w:r>
@@ -807,7 +997,7 @@
           <w:ilvl w:val="0"/>
           <w:numId w:val="2"/>
         </w:numPr>
-        <w:spacing w:after="80" w:line="240" w:lineRule="auto"/>
+        <w:spacing w:line="276" w:lineRule="auto"/>
         <w:ind w:left="800" w:hanging="400"/>
       </w:pPr>
       <w:r>
@@ -817,6 +1007,11 @@
         </w:rPr>
         <w:t xml:space="preserve">This item is back at level 0, and it continues the outer count rather than starting it again.</w:t>
       </w:r>
+    </w:p>
+    <w:p>
+      <w:pPr>
+        <w:spacing w:line="276" w:lineRule="auto"/>
+      </w:pPr>
     </w:p>
     <w:p>
       <w:pPr>
@@ -825,7 +1020,7 @@
           <w:ilvl w:val="0"/>
           <w:numId w:val="1"/>
         </w:numPr>
-        <w:spacing w:after="80" w:line="240" w:lineRule="auto"/>
+        <w:spacing w:line="276" w:lineRule="auto"/>
         <w:ind w:left="800" w:hanging="400"/>
       </w:pPr>
       <w:r>
@@ -843,7 +1038,7 @@
           <w:ilvl w:val="1"/>
           <w:numId w:val="1"/>
         </w:numPr>
-        <w:spacing w:after="80" w:line="240" w:lineRule="auto"/>
+        <w:spacing w:line="276" w:lineRule="auto"/>
         <w:ind w:left="1160" w:hanging="360"/>
       </w:pPr>
       <w:r>
@@ -856,9 +1051,17 @@
     </w:p>
     <w:p>
       <w:pPr>
+        <w:spacing w:line="276" w:lineRule="auto"/>
+      </w:pPr>
+    </w:p>
+    <w:p>
+      <w:pPr>
         <w:pStyle w:val="Heading2"/>
-        <w:spacing w:before="320" w:after="120"/>
-      </w:pPr>
+        <w:spacing w:line="276" w:lineRule="auto"/>
+      </w:pPr>
+      <w:r>
+        <w:br w:type="page"/>
+      </w:r>
       <w:r>
         <w:rPr>
           <w:b/>
@@ -867,12 +1070,12 @@
           <w:sz w:val="26"/>
           <w:szCs w:val="26"/>
         </w:rPr>
-        <w:t xml:space="preserve">11. A table</w:t>
-      </w:r>
-    </w:p>
-    <w:p>
-      <w:pPr>
-        <w:spacing w:after="140" w:line="276" w:lineRule="auto"/>
+        <w:t xml:space="preserve">12. Tables</w:t>
+      </w:r>
+    </w:p>
+    <w:p>
+      <w:pPr>
+        <w:spacing w:line="276" w:lineRule="auto"/>
         <w:jc w:val="both"/>
       </w:pPr>
       <w:r>
@@ -882,6 +1085,11 @@
         </w:rPr>
         <w:t xml:space="preserve">The rules, padding and vertical placement inside a cell are read from the table. Each row below says what it shows; the last three rows include one merge across columns and one merge across rows.</w:t>
       </w:r>
+    </w:p>
+    <w:p>
+      <w:pPr>
+        <w:spacing w:line="276" w:lineRule="auto"/>
+      </w:pPr>
     </w:p>
     <w:tbl>
       <w:tblPr>
@@ -914,7 +1122,7 @@
           </w:tcPr>
           <w:p>
             <w:pPr>
-              <w:spacing w:after="0" w:line="240" w:lineRule="auto"/>
+              <w:spacing w:line="276" w:lineRule="auto"/>
             </w:pPr>
             <w:r>
               <w:rPr>
@@ -941,7 +1149,7 @@
           </w:tcPr>
           <w:p>
             <w:pPr>
-              <w:spacing w:after="0" w:line="240" w:lineRule="auto"/>
+              <w:spacing w:line="276" w:lineRule="auto"/>
             </w:pPr>
             <w:r>
               <w:rPr>
@@ -968,7 +1176,7 @@
           </w:tcPr>
           <w:p>
             <w:pPr>
-              <w:spacing w:after="0" w:line="240" w:lineRule="auto"/>
+              <w:spacing w:line="276" w:lineRule="auto"/>
               <w:jc w:val="center"/>
             </w:pPr>
             <w:r>
@@ -997,7 +1205,7 @@
           </w:tcPr>
           <w:p>
             <w:pPr>
-              <w:spacing w:after="0" w:line="240" w:lineRule="auto"/>
+              <w:spacing w:line="276" w:lineRule="auto"/>
             </w:pPr>
             <w:r>
               <w:rPr>
@@ -1020,7 +1228,7 @@
           </w:tcPr>
           <w:p>
             <w:pPr>
-              <w:spacing w:after="0" w:line="240" w:lineRule="auto"/>
+              <w:spacing w:line="276" w:lineRule="auto"/>
             </w:pPr>
             <w:r>
               <w:rPr>
@@ -1043,7 +1251,7 @@
           </w:tcPr>
           <w:p>
             <w:pPr>
-              <w:spacing w:after="0" w:line="240" w:lineRule="auto"/>
+              <w:spacing w:line="276" w:lineRule="auto"/>
               <w:jc w:val="center"/>
             </w:pPr>
             <w:r>
@@ -1069,7 +1277,7 @@
           </w:tcPr>
           <w:p>
             <w:pPr>
-              <w:spacing w:after="0" w:line="240" w:lineRule="auto"/>
+              <w:spacing w:line="276" w:lineRule="auto"/>
             </w:pPr>
             <w:r>
               <w:rPr>
@@ -1092,7 +1300,7 @@
           </w:tcPr>
           <w:p>
             <w:pPr>
-              <w:spacing w:after="0" w:line="240" w:lineRule="auto"/>
+              <w:spacing w:line="276" w:lineRule="auto"/>
             </w:pPr>
             <w:r>
               <w:rPr>
@@ -1115,7 +1323,7 @@
           </w:tcPr>
           <w:p>
             <w:pPr>
-              <w:spacing w:after="0" w:line="240" w:lineRule="auto"/>
+              <w:spacing w:line="276" w:lineRule="auto"/>
               <w:jc w:val="center"/>
             </w:pPr>
             <w:r>
@@ -1141,7 +1349,7 @@
           </w:tcPr>
           <w:p>
             <w:pPr>
-              <w:spacing w:after="0" w:line="240" w:lineRule="auto"/>
+              <w:spacing w:line="276" w:lineRule="auto"/>
             </w:pPr>
             <w:r>
               <w:rPr>
@@ -1166,7 +1374,7 @@
           </w:tcPr>
           <w:p>
             <w:pPr>
-              <w:spacing w:after="0" w:line="240" w:lineRule="auto"/>
+              <w:spacing w:line="276" w:lineRule="auto"/>
             </w:pPr>
             <w:r>
               <w:rPr>
@@ -1193,7 +1401,7 @@
           </w:tcPr>
           <w:p>
             <w:pPr>
-              <w:spacing w:after="0" w:line="240" w:lineRule="auto"/>
+              <w:spacing w:line="276" w:lineRule="auto"/>
             </w:pPr>
             <w:r>
               <w:rPr>
@@ -1216,7 +1424,7 @@
           </w:tcPr>
           <w:p>
             <w:pPr>
-              <w:spacing w:after="0" w:line="240" w:lineRule="auto"/>
+              <w:spacing w:line="276" w:lineRule="auto"/>
             </w:pPr>
             <w:r>
               <w:rPr>
@@ -1239,7 +1447,7 @@
           </w:tcPr>
           <w:p>
             <w:pPr>
-              <w:spacing w:after="0" w:line="240" w:lineRule="auto"/>
+              <w:spacing w:line="276" w:lineRule="auto"/>
               <w:jc w:val="center"/>
             </w:pPr>
             <w:r>
@@ -1267,7 +1475,7 @@
           </w:tcPr>
           <w:p>
             <w:pPr>
-              <w:spacing w:after="0" w:line="240" w:lineRule="auto"/>
+              <w:spacing w:line="276" w:lineRule="auto"/>
             </w:pPr>
           </w:p>
         </w:tc>
@@ -1283,7 +1491,7 @@
           </w:tcPr>
           <w:p>
             <w:pPr>
-              <w:spacing w:after="0" w:line="240" w:lineRule="auto"/>
+              <w:spacing w:line="276" w:lineRule="auto"/>
             </w:pPr>
             <w:r>
               <w:rPr>
@@ -1306,7 +1514,7 @@
           </w:tcPr>
           <w:p>
             <w:pPr>
-              <w:spacing w:after="0" w:line="240" w:lineRule="auto"/>
+              <w:spacing w:line="276" w:lineRule="auto"/>
               <w:jc w:val="center"/>
             </w:pPr>
             <w:r>
@@ -1322,12 +1530,14 @@
     </w:tbl>
     <w:p>
       <w:pPr>
+        <w:spacing w:line="276" w:lineRule="auto"/>
+      </w:pPr>
+    </w:p>
+    <w:p>
+      <w:pPr>
         <w:pStyle w:val="Heading2"/>
-        <w:spacing w:before="0" w:after="120"/>
-      </w:pPr>
-      <w:r>
-        <w:br w:type="page"/>
-      </w:r>
+        <w:spacing w:line="276" w:lineRule="auto"/>
+      </w:pPr>
       <w:r>
         <w:rPr>
           <w:b/>
@@ -1336,197 +1546,22 @@
           <w:sz w:val="26"/>
           <w:szCs w:val="26"/>
         </w:rPr>
-        <w:t xml:space="preserve">12. A link and a locked stretch</w:t>
-      </w:r>
-    </w:p>
-    <w:p>
-      <w:pPr>
-        <w:spacing w:after="140" w:line="276" w:lineRule="auto"/>
-        <w:jc w:val="both"/>
-      </w:pPr>
-      <w:r>
-        <w:rPr>
-          <w:sz w:val="22"/>
-          <w:szCs w:val="22"/>
-        </w:rPr>
-        <w:t xml:space="preserve">The address ending this sentence is a </w:t>
-      </w:r>
-      <w:r>
-        <w:rPr>
-          <w:b/>
-          <w:bCs/>
-          <w:sz w:val="22"/>
-          <w:szCs w:val="22"/>
-        </w:rPr>
-        <w:t xml:space="preserve">w:hyperlink</w:t>
-      </w:r>
-      <w:r>
-        <w:rPr>
-          <w:sz w:val="22"/>
-          <w:szCs w:val="22"/>
-        </w:rPr>
-        <w:t xml:space="preserve">, an r:id pointing at an External relationship, with a w:tooltip riding along untouched: </w:t>
-      </w:r>
-      <w:hyperlink r:id="rId9" w:history="1" w:tooltip="The full feature table">
-        <w:r>
-          <w:rPr>
-            <w:rStyle w:val="Hyperlink"/>
-            <w:sz w:val="22"/>
-            <w:szCs w:val="22"/>
-          </w:rPr>
-          <w:t xml:space="preserve">example.com/editor/features</w:t>
-        </w:r>
-      </w:hyperlink>
-      <w:r>
-        <w:rPr>
-          <w:sz w:val="22"/>
-          <w:szCs w:val="22"/>
-        </w:rPr>
-        <w:t xml:space="preserve">.</w:t>
-      </w:r>
-    </w:p>
-    <w:p>
-      <w:pPr>
-        <w:spacing w:after="140" w:line="276" w:lineRule="auto"/>
-        <w:jc w:val="both"/>
-      </w:pPr>
-      <w:r>
-        <w:rPr>
-          <w:sz w:val="22"/>
-          <w:szCs w:val="22"/>
-        </w:rPr>
-        <w:t xml:space="preserve">A content control can shut against editing, and </w:t>
-      </w:r>
-      <w:sdt>
-        <w:sdtPr>
-          <w:id w:val="302"/>
-          <w:lock w:val="sdtContentLocked"/>
-        </w:sdtPr>
-        <w:sdtContent>
-          <w:r>
-            <w:rPr>
-              <w:sz w:val="22"/>
-              <w:szCs w:val="22"/>
-            </w:rPr>
-            <w:t xml:space="preserve">these nine words are inside a locked content control</w:t>
-          </w:r>
-        </w:sdtContent>
-      </w:sdt>
-      <w:r>
-        <w:rPr>
-          <w:sz w:val="22"/>
-          <w:szCs w:val="22"/>
-        </w:rPr>
-        <w:t xml:space="preserve"> (w:sdt with w:lock sdtContentLocked). Every edit inside it is refused, and so is a deletion that would swallow it, while the text on either side stays editable.</w:t>
-      </w:r>
-    </w:p>
-    <w:p>
-      <w:pPr>
-        <w:pStyle w:val="Heading2"/>
-        <w:spacing w:before="320" w:after="120"/>
-      </w:pPr>
-      <w:r>
-        <w:rPr>
-          <w:b/>
-          <w:bCs/>
-          <w:color w:val="1F3864"/>
-          <w:sz w:val="26"/>
-          <w:szCs w:val="26"/>
-        </w:rPr>
-        <w:t xml:space="preserve">13. Comments, bookmarks and notes</w:t>
-      </w:r>
-    </w:p>
-    <w:p>
-      <w:pPr>
-        <w:spacing w:after="140" w:line="276" w:lineRule="auto"/>
-        <w:jc w:val="both"/>
-      </w:pPr>
-      <w:r>
-        <w:t xml:space="preserve">This paragraph has a </w:t>
-      </w:r>
-      <w:commentRangeStart w:id="0"/>
-      <w:r>
-        <w:rPr>
-          <w:shd w:val="clear" w:color="auto" w:fill="FFF2CC"/>
-        </w:rPr>
-        <w:t xml:space="preserve">commented range</w:t>
-      </w:r>
-      <w:commentRangeEnd w:id="0"/>
-      <w:r>
-        <w:commentReference w:id="0"/>
-      </w:r>
-      <w:r>
-        <w:t xml:space="preserve"> connected to a comment thread. The thread can be edited or removed from the comments panel.</w:t>
-      </w:r>
-    </w:p>
-    <w:p>
-      <w:pPr>
-        <w:spacing w:after="140" w:line="276" w:lineRule="auto"/>
-        <w:jc w:val="both"/>
-      </w:pPr>
-      <w:r>
-        <w:t xml:space="preserve">A bookmark is an invisible named range. </w:t>
-      </w:r>
-      <w:bookmarkStart w:id="1" w:name="FeatureExamples"/>
-      <w:r>
-        <w:t xml:space="preserve">This sentence is inside the FeatureExamples bookmark.</w:t>
-      </w:r>
-      <w:bookmarkEnd w:id="1"/>
-    </w:p>
-    <w:p>
-      <w:pPr>
-        <w:spacing w:after="140" w:line="276" w:lineRule="auto"/>
-        <w:jc w:val="both"/>
-      </w:pPr>
-      <w:r>
-        <w:t xml:space="preserve">This sentence carries a footnote</w:t>
-      </w:r>
-      <w:r>
-        <w:footnoteReference w:id="1"/>
-      </w:r>
-      <w:r>
-        <w:t xml:space="preserve"> and this one carries an endnote</w:t>
-      </w:r>
-      <w:r>
-        <w:endnoteReference w:id="1"/>
-      </w:r>
-      <w:r>
-        <w:t xml:space="preserve">. Their plain-text bodies are available below the document.</w:t>
-      </w:r>
-    </w:p>
-    <w:p>
-      <w:pPr>
-        <w:spacing w:after="140" w:line="276" w:lineRule="auto"/>
-        <w:jc w:val="both"/>
-      </w:pPr>
-      <w:r>
-        <w:t xml:space="preserve">The header above comes from header1.xml. The footer below comes from footer1.xml and contains a PAGE field evaluated by the preview.</w:t>
-      </w:r>
-    </w:p>
-    <w:p>
-      <w:pPr>
-        <w:pStyle w:val="Heading2"/>
-        <w:spacing w:before="320" w:after="120"/>
-      </w:pPr>
-      <w:r>
-        <w:rPr>
-          <w:b/>
-          <w:bCs/>
-          <w:color w:val="1F3864"/>
-          <w:sz w:val="26"/>
-          <w:szCs w:val="26"/>
-        </w:rPr>
-        <w:t xml:space="preserve">14. Cell alignment and padding</w:t>
-      </w:r>
-    </w:p>
-    <w:p>
-      <w:pPr>
-        <w:spacing w:after="140" w:line="276" w:lineRule="auto"/>
+        <w:t xml:space="preserve">13. Cell alignment and padding</w:t>
+      </w:r>
+    </w:p>
+    <w:p>
+      <w:pPr>
+        <w:spacing w:line="276" w:lineRule="auto"/>
         <w:jc w:val="both"/>
       </w:pPr>
       <w:r>
         <w:t xml:space="preserve">The row below is tall enough to show top, centre and bottom alignment. Its table-level cell margins provide 6 pt vertical and 9 pt horizontal padding.</w:t>
       </w:r>
+    </w:p>
+    <w:p>
+      <w:pPr>
+        <w:spacing w:line="276" w:lineRule="auto"/>
+      </w:pPr>
     </w:p>
     <w:tbl>
       <w:tblPr>
@@ -1561,7 +1596,7 @@
           </w:tcPr>
           <w:p>
             <w:pPr>
-              <w:spacing w:after="0" w:line="240" w:lineRule="auto"/>
+              <w:spacing w:line="276" w:lineRule="auto"/>
               <w:jc w:val="center"/>
             </w:pPr>
             <w:r>
@@ -1582,7 +1617,7 @@
           </w:tcPr>
           <w:p>
             <w:pPr>
-              <w:spacing w:after="0" w:line="240" w:lineRule="auto"/>
+              <w:spacing w:line="276" w:lineRule="auto"/>
               <w:jc w:val="center"/>
             </w:pPr>
             <w:r>
@@ -1603,7 +1638,7 @@
           </w:tcPr>
           <w:p>
             <w:pPr>
-              <w:spacing w:after="0" w:line="240" w:lineRule="auto"/>
+              <w:spacing w:line="276" w:lineRule="auto"/>
               <w:jc w:val="center"/>
             </w:pPr>
             <w:r>
@@ -1621,25 +1656,238 @@
     </w:tbl>
     <w:p>
       <w:pPr>
-        <w:spacing w:after="0" w:line="240" w:lineRule="auto"/>
-        <w:rPr>
-          <w:sz w:val="22"/>
-          <w:szCs w:val="22"/>
-        </w:rPr>
-      </w:pPr>
-    </w:p>
-    <w:p>
-      <w:pPr>
-        <w:spacing w:after="0" w:line="240" w:lineRule="auto"/>
-        <w:rPr>
-          <w:sz w:val="22"/>
-          <w:szCs w:val="22"/>
-        </w:rPr>
-      </w:pPr>
-    </w:p>
-    <w:p>
-      <w:pPr>
-        <w:spacing w:before="200" w:after="60"/>
+        <w:spacing w:line="276" w:lineRule="auto"/>
+      </w:pPr>
+    </w:p>
+    <w:p>
+      <w:pPr>
+        <w:pStyle w:val="Heading2"/>
+        <w:spacing w:line="276" w:lineRule="auto"/>
+      </w:pPr>
+      <w:r>
+        <w:rPr>
+          <w:b/>
+          <w:bCs/>
+          <w:color w:val="1F3864"/>
+          <w:sz w:val="26"/>
+          <w:szCs w:val="26"/>
+        </w:rPr>
+        <w:t xml:space="preserve">14. Comments, bookmarks and notes</w:t>
+      </w:r>
+    </w:p>
+    <w:p>
+      <w:pPr>
+        <w:spacing w:line="276" w:lineRule="auto"/>
+        <w:jc w:val="both"/>
+      </w:pPr>
+      <w:r>
+        <w:t xml:space="preserve">This paragraph has a </w:t>
+      </w:r>
+      <w:commentRangeStart w:id="0"/>
+      <w:r>
+        <w:rPr>
+          <w:shd w:val="clear" w:color="auto" w:fill="FFF2CC"/>
+        </w:rPr>
+        <w:t xml:space="preserve">commented range</w:t>
+      </w:r>
+      <w:commentRangeEnd w:id="0"/>
+      <w:r>
+        <w:commentReference w:id="0"/>
+      </w:r>
+      <w:r>
+        <w:t xml:space="preserve"> connected to a comment thread. The thread can be replied to, resolved and reopened, or removed altogether, from the comments panel.</w:t>
+      </w:r>
+    </w:p>
+    <w:p>
+      <w:pPr>
+        <w:spacing w:line="276" w:lineRule="auto"/>
+      </w:pPr>
+    </w:p>
+    <w:p>
+      <w:pPr>
+        <w:spacing w:line="276" w:lineRule="auto"/>
+        <w:jc w:val="both"/>
+      </w:pPr>
+      <w:r>
+        <w:t xml:space="preserve">A bookmark is an invisible named range. </w:t>
+      </w:r>
+      <w:bookmarkStart w:id="1" w:name="FeatureExamples"/>
+      <w:r>
+        <w:t xml:space="preserve">This sentence is inside the FeatureExamples bookmark.</w:t>
+      </w:r>
+      <w:bookmarkEnd w:id="1"/>
+    </w:p>
+    <w:p>
+      <w:pPr>
+        <w:spacing w:line="276" w:lineRule="auto"/>
+      </w:pPr>
+    </w:p>
+    <w:p>
+      <w:pPr>
+        <w:spacing w:line="276" w:lineRule="auto"/>
+        <w:jc w:val="both"/>
+      </w:pPr>
+      <w:r>
+        <w:t xml:space="preserve">This sentence carries a footnote</w:t>
+      </w:r>
+      <w:r>
+        <w:footnoteReference w:id="1"/>
+      </w:r>
+      <w:r>
+        <w:t xml:space="preserve"> and this one carries an endnote</w:t>
+      </w:r>
+      <w:r>
+        <w:endnoteReference w:id="1"/>
+      </w:r>
+      <w:r>
+        <w:t xml:space="preserve">. Their plain-text bodies are available below the document.</w:t>
+      </w:r>
+    </w:p>
+    <w:p>
+      <w:pPr>
+        <w:spacing w:line="276" w:lineRule="auto"/>
+      </w:pPr>
+    </w:p>
+    <w:p>
+      <w:pPr>
+        <w:spacing w:line="276" w:lineRule="auto"/>
+        <w:jc w:val="both"/>
+      </w:pPr>
+      <w:r>
+        <w:t xml:space="preserve">The header above comes from header1.xml. The footer below comes from footer1.xml and contains a PAGE field evaluated by the preview.</w:t>
+      </w:r>
+    </w:p>
+    <w:p>
+      <w:pPr>
+        <w:spacing w:line="276" w:lineRule="auto"/>
+      </w:pPr>
+    </w:p>
+    <w:p>
+      <w:pPr>
+        <w:pStyle w:val="Heading2"/>
+        <w:spacing w:line="276" w:lineRule="auto"/>
+      </w:pPr>
+      <w:r>
+        <w:br w:type="page"/>
+      </w:r>
+      <w:r>
+        <w:rPr>
+          <w:b/>
+          <w:bCs/>
+          <w:color w:val="1F3864"/>
+          <w:sz w:val="26"/>
+          <w:szCs w:val="26"/>
+        </w:rPr>
+        <w:t xml:space="preserve">15. Links and locked content</w:t>
+      </w:r>
+    </w:p>
+    <w:p>
+      <w:pPr>
+        <w:spacing w:line="276" w:lineRule="auto"/>
+        <w:jc w:val="both"/>
+      </w:pPr>
+      <w:r>
+        <w:rPr>
+          <w:sz w:val="22"/>
+          <w:szCs w:val="22"/>
+        </w:rPr>
+        <w:t xml:space="preserve">The address ending this sentence is a </w:t>
+      </w:r>
+      <w:r>
+        <w:rPr>
+          <w:b/>
+          <w:bCs/>
+          <w:sz w:val="22"/>
+          <w:szCs w:val="22"/>
+        </w:rPr>
+        <w:t xml:space="preserve">w:hyperlink</w:t>
+      </w:r>
+      <w:r>
+        <w:rPr>
+          <w:sz w:val="22"/>
+          <w:szCs w:val="22"/>
+        </w:rPr>
+        <w:t xml:space="preserve">, an r:id pointing at an External relationship, with a w:tooltip riding along untouched: </w:t>
+      </w:r>
+      <w:hyperlink r:id="rId9" w:history="1" w:tooltip="The full feature table">
+        <w:r>
+          <w:rPr>
+            <w:rStyle w:val="Hyperlink"/>
+            <w:sz w:val="22"/>
+            <w:szCs w:val="22"/>
+          </w:rPr>
+          <w:t xml:space="preserve">example.com/editor/features</w:t>
+        </w:r>
+      </w:hyperlink>
+      <w:r>
+        <w:rPr>
+          <w:sz w:val="22"/>
+          <w:szCs w:val="22"/>
+        </w:rPr>
+        <w:t xml:space="preserve">.</w:t>
+      </w:r>
+    </w:p>
+    <w:p>
+      <w:pPr>
+        <w:spacing w:line="276" w:lineRule="auto"/>
+      </w:pPr>
+    </w:p>
+    <w:p>
+      <w:pPr>
+        <w:spacing w:line="276" w:lineRule="auto"/>
+        <w:jc w:val="both"/>
+      </w:pPr>
+      <w:r>
+        <w:rPr>
+          <w:sz w:val="22"/>
+          <w:szCs w:val="22"/>
+        </w:rPr>
+        <w:t xml:space="preserve">A content control can shut against editing, and </w:t>
+      </w:r>
+      <w:sdt>
+        <w:sdtPr>
+          <w:id w:val="302"/>
+          <w:lock w:val="sdtContentLocked"/>
+        </w:sdtPr>
+        <w:sdtContent>
+          <w:r>
+            <w:rPr>
+              <w:sz w:val="22"/>
+              <w:szCs w:val="22"/>
+            </w:rPr>
+            <w:t xml:space="preserve">these nine words are inside a locked content control</w:t>
+          </w:r>
+        </w:sdtContent>
+      </w:sdt>
+      <w:r>
+        <w:rPr>
+          <w:sz w:val="22"/>
+          <w:szCs w:val="22"/>
+        </w:rPr>
+        <w:t xml:space="preserve"> (w:sdt with w:lock sdtContentLocked). Every edit inside it is refused, and so is a deletion that would swallow it, while the text on either side stays editable.</w:t>
+      </w:r>
+    </w:p>
+    <w:p>
+      <w:pPr>
+        <w:spacing w:line="276" w:lineRule="auto"/>
+        <w:rPr>
+          <w:sz w:val="22"/>
+          <w:szCs w:val="22"/>
+        </w:rPr>
+      </w:pPr>
+    </w:p>
+    <w:p>
+      <w:pPr>
+        <w:spacing w:line="276" w:lineRule="auto"/>
+        <w:rPr>
+          <w:sz w:val="22"/>
+          <w:szCs w:val="22"/>
+        </w:rPr>
+      </w:pPr>
+    </w:p>
+    <w:p>
+      <w:pPr>
+        <w:spacing w:line="276" w:lineRule="auto"/>
         <w:jc w:val="center"/>
       </w:pPr>
       <w:r>
@@ -1685,25 +1933,25 @@
     </w:p>
     <w:p>
       <w:pPr>
-        <w:spacing w:after="0" w:line="240" w:lineRule="auto"/>
-        <w:rPr>
-          <w:sz w:val="22"/>
-          <w:szCs w:val="22"/>
-        </w:rPr>
-      </w:pPr>
-    </w:p>
-    <w:p>
-      <w:pPr>
-        <w:spacing w:after="0" w:line="240" w:lineRule="auto"/>
-        <w:rPr>
-          <w:sz w:val="22"/>
-          <w:szCs w:val="22"/>
-        </w:rPr>
-      </w:pPr>
-    </w:p>
-    <w:p>
-      <w:pPr>
-        <w:spacing w:after="240"/>
+        <w:spacing w:line="276" w:lineRule="auto"/>
+        <w:rPr>
+          <w:sz w:val="22"/>
+          <w:szCs w:val="22"/>
+        </w:rPr>
+      </w:pPr>
+    </w:p>
+    <w:p>
+      <w:pPr>
+        <w:spacing w:line="276" w:lineRule="auto"/>
+        <w:rPr>
+          <w:sz w:val="22"/>
+          <w:szCs w:val="22"/>
+        </w:rPr>
+      </w:pPr>
+    </w:p>
+    <w:p>
+      <w:pPr>
+        <w:spacing w:line="276" w:lineRule="auto"/>
         <w:jc w:val="center"/>
       </w:pPr>
       <w:r>
@@ -1734,7 +1982,7 @@
   <w:comment w:id="0" w:author="Demo Author" w:initials="DA" w:date="2026-08-22T00:00:00Z">
     <w:p>
       <w:r>
-        <w:t xml:space="preserve">Comments can be created, edited and deleted.</w:t>
+        <w:t xml:space="preserve">A comment can be replied to, resolved and reopened, and it records who wrote it.</w:t>
       </w:r>
     </w:p>
   </w:comment>

</xml_diff>